<commit_message>
manuscript: Table 3 with differences relative to Nelson et al.; OSM-only rows from the 2.0.1 --no-weiss pass
Co-Authored-By: Claude Opus 5.5 <noreply@anthropic.com>
Claude-Session: https://claude.ai/code/session_01Ses5XqMmtfDDhLGJ5mfib8
</commit_message>
<xml_diff>
--- a/global_accessibility/manuscript/Manuscript_v2_Methods_Results_Discussion_Suppl.docx
+++ b/global_accessibility/manuscript/Manuscript_v2_Methods_Results_Discussion_Suppl.docx
@@ -1113,7 +1113,7 @@
         <w:jc w:val="both"/>
       </w:pPr>
       <w:r>
-        <w:t xml:space="preserve">Our 2015 and end-year layers were compared cell by cell with the corresponding 2015 layers of Nelson et al. (2019) (figshare 10.6084/m9.figshare.7638134, version 4; the rasters are identical to version 3 cited by the R package geodata, verified by MD5 checksum). For each layer we report the mean and mean absolute difference, the share of cells within ±30 minutes, the Pearson correlation of log(1 + minutes), and population-weighted means, for all cells and for the </w:t>
+        <w:t xml:space="preserve">Our 2015 and end-year layers were compared cell by cell with the corresponding 2015 layers of Nelson et al. (2019) (figshare 10.6084/m9.figshare.7638134, version 4; the rasters are identical to version 3 cited by the R package geodata, verified by MD5 checksum). For each layer, with d = ours − Nelson per cell, we report the bias (mean d) and the mean absolute difference (mean |d|), both also relative to Nelson et al. as ratios of sums (Σd / ΣNelson and Σ|d| / ΣNelson; ratios of sums remain defined in cells inside cities where Nelson is close to 0 minutes), the median per-cell percentage difference 100 d / Nelson over cells with Nelson &gt; 0 (the statistic Nelson et al. used against Google Maps), the share of cells within ±30 minutes, the Pearson correlation of log(1 + minutes), and population-weighted means, for all cells and for the </w:t>
       </w:r>
       <w:r>
         <w:rPr>
@@ -4628,7 +4628,7 @@
         <w:jc w:val="both"/>
       </w:pPr>
       <w:r>
-        <w:t xml:space="preserve">After completion of the 2015 network, our 2015 estimates agreed closely with Nelson et al. (2019) for settlements (Table 3). For settlements of ≥50,000, the population-weighted mean was 22.0 minutes against 23.1 minutes in Nelson et al.; 67% of cells were within ±30 minutes and the correlation of log travel times was 0.89. Without the completion step, i.e. with OSM 2015 roads only, the same indicators were 33.8 minutes, 44% and 0.80. For settlements of ≥5,000, the means were 8.7 and 7.9 minutes (r = 0.87). Travel time to ports was spatially consistent (r = 0.97) but on average longer in our estimates (262 against 203 minutes), which we attribute, at least in part, to the domain boundary: Nelson et al. can reach ports outside the domain, such as Lagos, Tema and Abidjan, which our regional run cannot [global: to be verified]. No tile of the domain reached the completeness threshold, so the comparison restricted to </w:t>
+        <w:t xml:space="preserve">After completion of the 2015 network, our 2015 estimates agreed closely with Nelson et al. (2019) for settlements (Table 3). For settlements of ≥50,000, the population-weighted mean was 22.0 minutes against 23.1 minutes in Nelson et al. (−4%); 67% of cells were within ±30 minutes and the correlation of log travel times was 0.89. Area-weighted, our estimates were longer (bias +16.2 minutes, +16% of the Nelson mean; median cell difference +9%), with a mean absolute difference of 33.1 minutes (32%); the contrast with the population-weighted bias (−4%) indicates that our estimates are longer mainly in sparsely populated cells. Without the completion step, i.e. with OSM 2015 roads only, the same indicators were 33.8 minutes (+46%), 44% and 0.80, and the relative bias was +70%. For settlements of ≥5,000, the population-weighted means were 8.7 and 7.9 minutes (+11%; area-weighted bias +31%, r = 0.87). Travel time to ports was spatially consistent (r = 0.97) but on average longer in our estimates (262 against 203 minutes, +29%; area-weighted +28%), which we attribute, at least in part, to the domain boundary: Nelson et al. can reach ports outside the domain, such as Lagos, Tema and Abidjan, which our regional run cannot [global: to be verified]. No tile of the domain reached the completeness threshold, so the comparison restricted to </w:t>
       </w:r>
       <w:r>
         <w:rPr>
@@ -4638,7 +4638,7 @@
         <w:t xml:space="preserve">OSM 2015 complete</w:t>
       </w:r>
       <w:r>
-        <w:t xml:space="preserve"> areas could not be made here [global]. Our 2026 estimates were shorter than the 2015 values of Nelson et al. for settlements (19.0 against 24.4 minutes for ≥50,000; population weights of 2025), consistent with the network growth described above.</w:t>
+        <w:t xml:space="preserve"> areas could not be made here [global]. Our 2026 estimates were shorter than the 2015 values of Nelson et al. for settlements (19.0 against 24.4 minutes for ≥50,000, −22%; population weights of 2025; area-weighted bias −6%), consistent with the network growth described above.</w:t>
       </w:r>
     </w:p>
     <w:p>
@@ -4660,7 +4660,71 @@
           <w:sz w:val="19"/>
           <w:szCs w:val="19"/>
         </w:rPr>
-        <w:t xml:space="preserve"> Comparison with the 2015 layers of Nelson et al. (2019), regional test domain [global]. Differences are ours − Nelson. </w:t>
+        <w:t xml:space="preserve"> Comparison with the 2015 layers of Nelson et al. (2019), regional test domain [global]. d = ours − Nelson for each cell. </w:t>
+      </w:r>
+      <w:r>
+        <w:rPr>
+          <w:i/>
+          <w:iCs/>
+          <w:sz w:val="19"/>
+          <w:szCs w:val="19"/>
+        </w:rPr>
+        <w:t xml:space="preserve">Bias</w:t>
+      </w:r>
+      <w:r>
+        <w:rPr>
+          <w:sz w:val="19"/>
+          <w:szCs w:val="19"/>
+        </w:rPr>
+        <w:t xml:space="preserve">: mean d, and in brackets Σd / Σ Nelson (i.e. relative to the Nelson mean over the same cells). </w:t>
+      </w:r>
+      <w:r>
+        <w:rPr>
+          <w:i/>
+          <w:iCs/>
+          <w:sz w:val="19"/>
+          <w:szCs w:val="19"/>
+        </w:rPr>
+        <w:t xml:space="preserve">Mean abs. diff.</w:t>
+      </w:r>
+      <w:r>
+        <w:rPr>
+          <w:sz w:val="19"/>
+          <w:szCs w:val="19"/>
+        </w:rPr>
+        <w:t xml:space="preserve">: mean |d|, and Σ|d| / Σ Nelson. </w:t>
+      </w:r>
+      <w:r>
+        <w:rPr>
+          <w:i/>
+          <w:iCs/>
+          <w:sz w:val="19"/>
+          <w:szCs w:val="19"/>
+        </w:rPr>
+        <w:t xml:space="preserve">Median cell diff.</w:t>
+      </w:r>
+      <w:r>
+        <w:rPr>
+          <w:sz w:val="19"/>
+          <w:szCs w:val="19"/>
+        </w:rPr>
+        <w:t xml:space="preserve">: median of 100 d / Nelson over cells with Nelson &gt; 0. </w:t>
+      </w:r>
+      <w:r>
+        <w:rPr>
+          <w:i/>
+          <w:iCs/>
+          <w:sz w:val="19"/>
+          <w:szCs w:val="19"/>
+        </w:rPr>
+        <w:t xml:space="preserve">Pop.-weighted</w:t>
+      </w:r>
+      <w:r>
+        <w:rPr>
+          <w:sz w:val="19"/>
+          <w:szCs w:val="19"/>
+        </w:rPr>
+        <w:t xml:space="preserve">: population-weighted means, bias in brackets relative to Nelson. </w:t>
       </w:r>
       <w:r>
         <w:rPr>
@@ -4692,7 +4756,7 @@
           <w:sz w:val="19"/>
           <w:szCs w:val="19"/>
         </w:rPr>
-        <w:t xml:space="preserve">: final method. Population weights: GHS-POP of our settlement epoch (2015 or 2025).</w:t>
+        <w:t xml:space="preserve">: final method. The 2026 rows compare our 2026 estimates with Nelson 2015. Population weights: GHS-POP of our settlement epoch (2015 or 2025).</w:t>
       </w:r>
     </w:p>
     <w:tbl>
@@ -4708,13 +4772,14 @@
         </w:tblBorders>
       </w:tblPr>
       <w:tblGrid>
-        <w:gridCol w:w="2500"/>
-        <w:gridCol w:w="950"/>
-        <w:gridCol w:w="1000"/>
-        <w:gridCol w:w="1050"/>
-        <w:gridCol w:w="950"/>
+        <w:gridCol w:w="2050"/>
+        <w:gridCol w:w="850"/>
+        <w:gridCol w:w="1150"/>
+        <w:gridCol w:w="1150"/>
+        <w:gridCol w:w="850"/>
         <w:gridCol w:w="800"/>
-        <w:gridCol w:w="1776"/>
+        <w:gridCol w:w="650"/>
+        <w:gridCol w:w="1526"/>
       </w:tblGrid>
       <w:tr>
         <w:trPr>
@@ -4722,7 +4787,7 @@
         </w:trPr>
         <w:tc>
           <w:tcPr>
-            <w:tcW w:type="dxa" w:w="2500"/>
+            <w:tcW w:type="dxa" w:w="2050"/>
             <w:tcBorders>
               <w:top w:val="single" w:color="BFBFBF" w:sz="4"/>
               <w:left w:val="single" w:color="BFBFBF" w:sz="4"/>
@@ -4754,7 +4819,7 @@
         </w:tc>
         <w:tc>
           <w:tcPr>
-            <w:tcW w:type="dxa" w:w="950"/>
+            <w:tcW w:type="dxa" w:w="850"/>
             <w:tcBorders>
               <w:top w:val="single" w:color="BFBFBF" w:sz="4"/>
               <w:left w:val="single" w:color="BFBFBF" w:sz="4"/>
@@ -4786,7 +4851,7 @@
         </w:tc>
         <w:tc>
           <w:tcPr>
-            <w:tcW w:type="dxa" w:w="1000"/>
+            <w:tcW w:type="dxa" w:w="1150"/>
             <w:tcBorders>
               <w:top w:val="single" w:color="BFBFBF" w:sz="4"/>
               <w:left w:val="single" w:color="BFBFBF" w:sz="4"/>
@@ -4812,13 +4877,13 @@
                 <w:sz w:val="17"/>
                 <w:szCs w:val="17"/>
               </w:rPr>
-              <w:t xml:space="preserve">Mean diff. (min)</w:t>
-            </w:r>
-          </w:p>
-        </w:tc>
-        <w:tc>
-          <w:tcPr>
-            <w:tcW w:type="dxa" w:w="1050"/>
+              <w:t xml:space="preserve">Bias, min (% of Nelson)</w:t>
+            </w:r>
+          </w:p>
+        </w:tc>
+        <w:tc>
+          <w:tcPr>
+            <w:tcW w:type="dxa" w:w="1150"/>
             <w:tcBorders>
               <w:top w:val="single" w:color="BFBFBF" w:sz="4"/>
               <w:left w:val="single" w:color="BFBFBF" w:sz="4"/>
@@ -4844,13 +4909,13 @@
                 <w:sz w:val="17"/>
                 <w:szCs w:val="17"/>
               </w:rPr>
-              <w:t xml:space="preserve">Mean abs. diff. (min)</w:t>
-            </w:r>
-          </w:p>
-        </w:tc>
-        <w:tc>
-          <w:tcPr>
-            <w:tcW w:type="dxa" w:w="950"/>
+              <w:t xml:space="preserve">Mean abs. diff., min (% of Nelson)</w:t>
+            </w:r>
+          </w:p>
+        </w:tc>
+        <w:tc>
+          <w:tcPr>
+            <w:tcW w:type="dxa" w:w="850"/>
             <w:tcBorders>
               <w:top w:val="single" w:color="BFBFBF" w:sz="4"/>
               <w:left w:val="single" w:color="BFBFBF" w:sz="4"/>
@@ -4876,7 +4941,7 @@
                 <w:sz w:val="17"/>
                 <w:szCs w:val="17"/>
               </w:rPr>
-              <w:t xml:space="preserve">Within ±30 min</w:t>
+              <w:t xml:space="preserve">Median cell diff.</w:t>
             </w:r>
           </w:p>
         </w:tc>
@@ -4908,13 +4973,13 @@
                 <w:sz w:val="17"/>
                 <w:szCs w:val="17"/>
               </w:rPr>
-              <w:t xml:space="preserve">r (log)</w:t>
-            </w:r>
-          </w:p>
-        </w:tc>
-        <w:tc>
-          <w:tcPr>
-            <w:tcW w:type="dxa" w:w="1776"/>
+              <w:t xml:space="preserve">Within ±30 min</w:t>
+            </w:r>
+          </w:p>
+        </w:tc>
+        <w:tc>
+          <w:tcPr>
+            <w:tcW w:type="dxa" w:w="650"/>
             <w:tcBorders>
               <w:top w:val="single" w:color="BFBFBF" w:sz="4"/>
               <w:left w:val="single" w:color="BFBFBF" w:sz="4"/>
@@ -4940,7 +5005,39 @@
                 <w:sz w:val="17"/>
                 <w:szCs w:val="17"/>
               </w:rPr>
-              <w:t xml:space="preserve">Pop.-weighted: ours / Nelson (min)</w:t>
+              <w:t xml:space="preserve">r (log)</w:t>
+            </w:r>
+          </w:p>
+        </w:tc>
+        <w:tc>
+          <w:tcPr>
+            <w:tcW w:type="dxa" w:w="1526"/>
+            <w:tcBorders>
+              <w:top w:val="single" w:color="BFBFBF" w:sz="4"/>
+              <w:left w:val="single" w:color="BFBFBF" w:sz="4"/>
+              <w:bottom w:val="single" w:color="BFBFBF" w:sz="4"/>
+              <w:right w:val="single" w:color="BFBFBF" w:sz="4"/>
+            </w:tcBorders>
+            <w:shd w:fill="E8EEF7" w:val="clear"/>
+            <w:tcMar>
+              <w:top w:type="dxa" w:w="40"/>
+              <w:left w:type="dxa" w:w="80"/>
+              <w:bottom w:type="dxa" w:w="40"/>
+              <w:right w:type="dxa" w:w="80"/>
+            </w:tcMar>
+          </w:tcPr>
+          <w:p>
+            <w:pPr>
+              <w:jc w:val="right"/>
+            </w:pPr>
+            <w:r>
+              <w:rPr>
+                <w:b/>
+                <w:bCs/>
+                <w:sz w:val="17"/>
+                <w:szCs w:val="17"/>
+              </w:rPr>
+              <w:t xml:space="preserve">Pop.-weighted: ours / Nelson, min (bias)</w:t>
             </w:r>
           </w:p>
         </w:tc>
@@ -4948,7 +5045,7 @@
       <w:tr>
         <w:tc>
           <w:tcPr>
-            <w:tcW w:type="dxa" w:w="2500"/>
+            <w:tcW w:type="dxa" w:w="2050"/>
             <w:tcBorders>
               <w:top w:val="single" w:color="BFBFBF" w:sz="4"/>
               <w:left w:val="single" w:color="BFBFBF" w:sz="4"/>
@@ -4979,100 +5076,131 @@
         </w:tc>
         <w:tc>
           <w:tcPr>
-            <w:tcW w:type="dxa" w:w="950"/>
-            <w:tcBorders>
-              <w:top w:val="single" w:color="BFBFBF" w:sz="4"/>
-              <w:left w:val="single" w:color="BFBFBF" w:sz="4"/>
-              <w:bottom w:val="single" w:color="BFBFBF" w:sz="4"/>
-              <w:right w:val="single" w:color="BFBFBF" w:sz="4"/>
-            </w:tcBorders>
-            <w:tcMar>
-              <w:top w:type="dxa" w:w="40"/>
-              <w:left w:type="dxa" w:w="80"/>
-              <w:bottom w:type="dxa" w:w="40"/>
-              <w:right w:type="dxa" w:w="80"/>
-            </w:tcMar>
-          </w:tcPr>
-          <w:p>
-            <w:pPr>
-              <w:jc w:val="right"/>
-            </w:pPr>
-            <w:r>
-              <w:rPr>
-                <w:b w:val="false"/>
-                <w:bCs w:val="false"/>
-                <w:sz w:val="17"/>
-                <w:szCs w:val="17"/>
-              </w:rPr>
-              <w:t xml:space="preserve">576,291</w:t>
-            </w:r>
-          </w:p>
-        </w:tc>
-        <w:tc>
-          <w:tcPr>
-            <w:tcW w:type="dxa" w:w="1000"/>
-            <w:tcBorders>
-              <w:top w:val="single" w:color="BFBFBF" w:sz="4"/>
-              <w:left w:val="single" w:color="BFBFBF" w:sz="4"/>
-              <w:bottom w:val="single" w:color="BFBFBF" w:sz="4"/>
-              <w:right w:val="single" w:color="BFBFBF" w:sz="4"/>
-            </w:tcBorders>
-            <w:tcMar>
-              <w:top w:type="dxa" w:w="40"/>
-              <w:left w:type="dxa" w:w="80"/>
-              <w:bottom w:type="dxa" w:w="40"/>
-              <w:right w:type="dxa" w:w="80"/>
-            </w:tcMar>
-          </w:tcPr>
-          <w:p>
-            <w:pPr>
-              <w:jc w:val="right"/>
-            </w:pPr>
-            <w:r>
-              <w:rPr>
-                <w:b w:val="false"/>
-                <w:bCs w:val="false"/>
-                <w:sz w:val="17"/>
-                <w:szCs w:val="17"/>
-              </w:rPr>
-              <w:t xml:space="preserve">72.1</w:t>
-            </w:r>
-          </w:p>
-        </w:tc>
-        <w:tc>
-          <w:tcPr>
-            <w:tcW w:type="dxa" w:w="1050"/>
-            <w:tcBorders>
-              <w:top w:val="single" w:color="BFBFBF" w:sz="4"/>
-              <w:left w:val="single" w:color="BFBFBF" w:sz="4"/>
-              <w:bottom w:val="single" w:color="BFBFBF" w:sz="4"/>
-              <w:right w:val="single" w:color="BFBFBF" w:sz="4"/>
-            </w:tcBorders>
-            <w:tcMar>
-              <w:top w:type="dxa" w:w="40"/>
-              <w:left w:type="dxa" w:w="80"/>
-              <w:bottom w:type="dxa" w:w="40"/>
-              <w:right w:type="dxa" w:w="80"/>
-            </w:tcMar>
-          </w:tcPr>
-          <w:p>
-            <w:pPr>
-              <w:jc w:val="right"/>
-            </w:pPr>
-            <w:r>
-              <w:rPr>
-                <w:b w:val="false"/>
-                <w:bCs w:val="false"/>
-                <w:sz w:val="17"/>
-                <w:szCs w:val="17"/>
-              </w:rPr>
-              <w:t xml:space="preserve">84.0</w:t>
-            </w:r>
-          </w:p>
-        </w:tc>
-        <w:tc>
-          <w:tcPr>
-            <w:tcW w:type="dxa" w:w="950"/>
+            <w:tcW w:type="dxa" w:w="850"/>
+            <w:tcBorders>
+              <w:top w:val="single" w:color="BFBFBF" w:sz="4"/>
+              <w:left w:val="single" w:color="BFBFBF" w:sz="4"/>
+              <w:bottom w:val="single" w:color="BFBFBF" w:sz="4"/>
+              <w:right w:val="single" w:color="BFBFBF" w:sz="4"/>
+            </w:tcBorders>
+            <w:tcMar>
+              <w:top w:type="dxa" w:w="40"/>
+              <w:left w:type="dxa" w:w="80"/>
+              <w:bottom w:type="dxa" w:w="40"/>
+              <w:right w:type="dxa" w:w="80"/>
+            </w:tcMar>
+          </w:tcPr>
+          <w:p>
+            <w:pPr>
+              <w:jc w:val="right"/>
+            </w:pPr>
+            <w:r>
+              <w:rPr>
+                <w:b w:val="false"/>
+                <w:bCs w:val="false"/>
+                <w:sz w:val="17"/>
+                <w:szCs w:val="17"/>
+              </w:rPr>
+              <w:t xml:space="preserve">576,562</w:t>
+            </w:r>
+          </w:p>
+        </w:tc>
+        <w:tc>
+          <w:tcPr>
+            <w:tcW w:type="dxa" w:w="1150"/>
+            <w:tcBorders>
+              <w:top w:val="single" w:color="BFBFBF" w:sz="4"/>
+              <w:left w:val="single" w:color="BFBFBF" w:sz="4"/>
+              <w:bottom w:val="single" w:color="BFBFBF" w:sz="4"/>
+              <w:right w:val="single" w:color="BFBFBF" w:sz="4"/>
+            </w:tcBorders>
+            <w:tcMar>
+              <w:top w:type="dxa" w:w="40"/>
+              <w:left w:type="dxa" w:w="80"/>
+              <w:bottom w:type="dxa" w:w="40"/>
+              <w:right w:type="dxa" w:w="80"/>
+            </w:tcMar>
+          </w:tcPr>
+          <w:p>
+            <w:pPr>
+              <w:jc w:val="right"/>
+            </w:pPr>
+            <w:r>
+              <w:rPr>
+                <w:b w:val="false"/>
+                <w:bCs w:val="false"/>
+                <w:sz w:val="17"/>
+                <w:szCs w:val="17"/>
+              </w:rPr>
+              <w:t xml:space="preserve">+71.9 (+70%)</w:t>
+            </w:r>
+          </w:p>
+        </w:tc>
+        <w:tc>
+          <w:tcPr>
+            <w:tcW w:type="dxa" w:w="1150"/>
+            <w:tcBorders>
+              <w:top w:val="single" w:color="BFBFBF" w:sz="4"/>
+              <w:left w:val="single" w:color="BFBFBF" w:sz="4"/>
+              <w:bottom w:val="single" w:color="BFBFBF" w:sz="4"/>
+              <w:right w:val="single" w:color="BFBFBF" w:sz="4"/>
+            </w:tcBorders>
+            <w:tcMar>
+              <w:top w:type="dxa" w:w="40"/>
+              <w:left w:type="dxa" w:w="80"/>
+              <w:bottom w:type="dxa" w:w="40"/>
+              <w:right w:type="dxa" w:w="80"/>
+            </w:tcMar>
+          </w:tcPr>
+          <w:p>
+            <w:pPr>
+              <w:jc w:val="right"/>
+            </w:pPr>
+            <w:r>
+              <w:rPr>
+                <w:b w:val="false"/>
+                <w:bCs w:val="false"/>
+                <w:sz w:val="17"/>
+                <w:szCs w:val="17"/>
+              </w:rPr>
+              <w:t xml:space="preserve">83.8 (82%)</w:t>
+            </w:r>
+          </w:p>
+        </w:tc>
+        <w:tc>
+          <w:tcPr>
+            <w:tcW w:type="dxa" w:w="850"/>
+            <w:tcBorders>
+              <w:top w:val="single" w:color="BFBFBF" w:sz="4"/>
+              <w:left w:val="single" w:color="BFBFBF" w:sz="4"/>
+              <w:bottom w:val="single" w:color="BFBFBF" w:sz="4"/>
+              <w:right w:val="single" w:color="BFBFBF" w:sz="4"/>
+            </w:tcBorders>
+            <w:tcMar>
+              <w:top w:type="dxa" w:w="40"/>
+              <w:left w:type="dxa" w:w="80"/>
+              <w:bottom w:type="dxa" w:w="40"/>
+              <w:right w:type="dxa" w:w="80"/>
+            </w:tcMar>
+          </w:tcPr>
+          <w:p>
+            <w:pPr>
+              <w:jc w:val="right"/>
+            </w:pPr>
+            <w:r>
+              <w:rPr>
+                <w:b w:val="false"/>
+                <w:bCs w:val="false"/>
+                <w:sz w:val="17"/>
+                <w:szCs w:val="17"/>
+              </w:rPr>
+              <w:t xml:space="preserve">+42%</w:t>
+            </w:r>
+          </w:p>
+        </w:tc>
+        <w:tc>
+          <w:tcPr>
+            <w:tcW w:type="dxa" w:w="800"/>
             <w:tcBorders>
               <w:top w:val="single" w:color="BFBFBF" w:sz="4"/>
               <w:left w:val="single" w:color="BFBFBF" w:sz="4"/>
@@ -5103,7 +5231,7 @@
         </w:tc>
         <w:tc>
           <w:tcPr>
-            <w:tcW w:type="dxa" w:w="800"/>
+            <w:tcW w:type="dxa" w:w="650"/>
             <w:tcBorders>
               <w:top w:val="single" w:color="BFBFBF" w:sz="4"/>
               <w:left w:val="single" w:color="BFBFBF" w:sz="4"/>
@@ -5134,32 +5262,32 @@
         </w:tc>
         <w:tc>
           <w:tcPr>
-            <w:tcW w:type="dxa" w:w="1776"/>
-            <w:tcBorders>
-              <w:top w:val="single" w:color="BFBFBF" w:sz="4"/>
-              <w:left w:val="single" w:color="BFBFBF" w:sz="4"/>
-              <w:bottom w:val="single" w:color="BFBFBF" w:sz="4"/>
-              <w:right w:val="single" w:color="BFBFBF" w:sz="4"/>
-            </w:tcBorders>
-            <w:tcMar>
-              <w:top w:type="dxa" w:w="40"/>
-              <w:left w:type="dxa" w:w="80"/>
-              <w:bottom w:type="dxa" w:w="40"/>
-              <w:right w:type="dxa" w:w="80"/>
-            </w:tcMar>
-          </w:tcPr>
-          <w:p>
-            <w:pPr>
-              <w:jc w:val="right"/>
-            </w:pPr>
-            <w:r>
-              <w:rPr>
-                <w:b w:val="false"/>
-                <w:bCs w:val="false"/>
-                <w:sz w:val="17"/>
-                <w:szCs w:val="17"/>
-              </w:rPr>
-              <w:t xml:space="preserve">33.8 / 23.1</w:t>
+            <w:tcW w:type="dxa" w:w="1526"/>
+            <w:tcBorders>
+              <w:top w:val="single" w:color="BFBFBF" w:sz="4"/>
+              <w:left w:val="single" w:color="BFBFBF" w:sz="4"/>
+              <w:bottom w:val="single" w:color="BFBFBF" w:sz="4"/>
+              <w:right w:val="single" w:color="BFBFBF" w:sz="4"/>
+            </w:tcBorders>
+            <w:tcMar>
+              <w:top w:type="dxa" w:w="40"/>
+              <w:left w:type="dxa" w:w="80"/>
+              <w:bottom w:type="dxa" w:w="40"/>
+              <w:right w:type="dxa" w:w="80"/>
+            </w:tcMar>
+          </w:tcPr>
+          <w:p>
+            <w:pPr>
+              <w:jc w:val="right"/>
+            </w:pPr>
+            <w:r>
+              <w:rPr>
+                <w:b w:val="false"/>
+                <w:bCs w:val="false"/>
+                <w:sz w:val="17"/>
+                <w:szCs w:val="17"/>
+              </w:rPr>
+              <w:t xml:space="preserve">33.8 / 23.1 (+46%)</w:t>
             </w:r>
           </w:p>
         </w:tc>
@@ -5167,7 +5295,7 @@
       <w:tr>
         <w:tc>
           <w:tcPr>
-            <w:tcW w:type="dxa" w:w="2500"/>
+            <w:tcW w:type="dxa" w:w="2050"/>
             <w:tcBorders>
               <w:top w:val="single" w:color="BFBFBF" w:sz="4"/>
               <w:left w:val="single" w:color="BFBFBF" w:sz="4"/>
@@ -5198,7 +5326,7 @@
         </w:tc>
         <w:tc>
           <w:tcPr>
-            <w:tcW w:type="dxa" w:w="950"/>
+            <w:tcW w:type="dxa" w:w="850"/>
             <w:tcBorders>
               <w:top w:val="single" w:color="BFBFBF" w:sz="4"/>
               <w:left w:val="single" w:color="BFBFBF" w:sz="4"/>
@@ -5229,69 +5357,100 @@
         </w:tc>
         <w:tc>
           <w:tcPr>
-            <w:tcW w:type="dxa" w:w="1000"/>
-            <w:tcBorders>
-              <w:top w:val="single" w:color="BFBFBF" w:sz="4"/>
-              <w:left w:val="single" w:color="BFBFBF" w:sz="4"/>
-              <w:bottom w:val="single" w:color="BFBFBF" w:sz="4"/>
-              <w:right w:val="single" w:color="BFBFBF" w:sz="4"/>
-            </w:tcBorders>
-            <w:tcMar>
-              <w:top w:type="dxa" w:w="40"/>
-              <w:left w:type="dxa" w:w="80"/>
-              <w:bottom w:type="dxa" w:w="40"/>
-              <w:right w:type="dxa" w:w="80"/>
-            </w:tcMar>
-          </w:tcPr>
-          <w:p>
-            <w:pPr>
-              <w:jc w:val="right"/>
-            </w:pPr>
-            <w:r>
-              <w:rPr>
-                <w:b w:val="false"/>
-                <w:bCs w:val="false"/>
-                <w:sz w:val="17"/>
-                <w:szCs w:val="17"/>
-              </w:rPr>
-              <w:t xml:space="preserve">16.2</w:t>
-            </w:r>
-          </w:p>
-        </w:tc>
-        <w:tc>
-          <w:tcPr>
-            <w:tcW w:type="dxa" w:w="1050"/>
-            <w:tcBorders>
-              <w:top w:val="single" w:color="BFBFBF" w:sz="4"/>
-              <w:left w:val="single" w:color="BFBFBF" w:sz="4"/>
-              <w:bottom w:val="single" w:color="BFBFBF" w:sz="4"/>
-              <w:right w:val="single" w:color="BFBFBF" w:sz="4"/>
-            </w:tcBorders>
-            <w:tcMar>
-              <w:top w:type="dxa" w:w="40"/>
-              <w:left w:type="dxa" w:w="80"/>
-              <w:bottom w:type="dxa" w:w="40"/>
-              <w:right w:type="dxa" w:w="80"/>
-            </w:tcMar>
-          </w:tcPr>
-          <w:p>
-            <w:pPr>
-              <w:jc w:val="right"/>
-            </w:pPr>
-            <w:r>
-              <w:rPr>
-                <w:b w:val="false"/>
-                <w:bCs w:val="false"/>
-                <w:sz w:val="17"/>
-                <w:szCs w:val="17"/>
-              </w:rPr>
-              <w:t xml:space="preserve">33.1</w:t>
-            </w:r>
-          </w:p>
-        </w:tc>
-        <w:tc>
-          <w:tcPr>
-            <w:tcW w:type="dxa" w:w="950"/>
+            <w:tcW w:type="dxa" w:w="1150"/>
+            <w:tcBorders>
+              <w:top w:val="single" w:color="BFBFBF" w:sz="4"/>
+              <w:left w:val="single" w:color="BFBFBF" w:sz="4"/>
+              <w:bottom w:val="single" w:color="BFBFBF" w:sz="4"/>
+              <w:right w:val="single" w:color="BFBFBF" w:sz="4"/>
+            </w:tcBorders>
+            <w:tcMar>
+              <w:top w:type="dxa" w:w="40"/>
+              <w:left w:type="dxa" w:w="80"/>
+              <w:bottom w:type="dxa" w:w="40"/>
+              <w:right w:type="dxa" w:w="80"/>
+            </w:tcMar>
+          </w:tcPr>
+          <w:p>
+            <w:pPr>
+              <w:jc w:val="right"/>
+            </w:pPr>
+            <w:r>
+              <w:rPr>
+                <w:b w:val="false"/>
+                <w:bCs w:val="false"/>
+                <w:sz w:val="17"/>
+                <w:szCs w:val="17"/>
+              </w:rPr>
+              <w:t xml:space="preserve">+16.2 (+16%)</w:t>
+            </w:r>
+          </w:p>
+        </w:tc>
+        <w:tc>
+          <w:tcPr>
+            <w:tcW w:type="dxa" w:w="1150"/>
+            <w:tcBorders>
+              <w:top w:val="single" w:color="BFBFBF" w:sz="4"/>
+              <w:left w:val="single" w:color="BFBFBF" w:sz="4"/>
+              <w:bottom w:val="single" w:color="BFBFBF" w:sz="4"/>
+              <w:right w:val="single" w:color="BFBFBF" w:sz="4"/>
+            </w:tcBorders>
+            <w:tcMar>
+              <w:top w:type="dxa" w:w="40"/>
+              <w:left w:type="dxa" w:w="80"/>
+              <w:bottom w:type="dxa" w:w="40"/>
+              <w:right w:type="dxa" w:w="80"/>
+            </w:tcMar>
+          </w:tcPr>
+          <w:p>
+            <w:pPr>
+              <w:jc w:val="right"/>
+            </w:pPr>
+            <w:r>
+              <w:rPr>
+                <w:b w:val="false"/>
+                <w:bCs w:val="false"/>
+                <w:sz w:val="17"/>
+                <w:szCs w:val="17"/>
+              </w:rPr>
+              <w:t xml:space="preserve">33.1 (32%)</w:t>
+            </w:r>
+          </w:p>
+        </w:tc>
+        <w:tc>
+          <w:tcPr>
+            <w:tcW w:type="dxa" w:w="850"/>
+            <w:tcBorders>
+              <w:top w:val="single" w:color="BFBFBF" w:sz="4"/>
+              <w:left w:val="single" w:color="BFBFBF" w:sz="4"/>
+              <w:bottom w:val="single" w:color="BFBFBF" w:sz="4"/>
+              <w:right w:val="single" w:color="BFBFBF" w:sz="4"/>
+            </w:tcBorders>
+            <w:tcMar>
+              <w:top w:type="dxa" w:w="40"/>
+              <w:left w:type="dxa" w:w="80"/>
+              <w:bottom w:type="dxa" w:w="40"/>
+              <w:right w:type="dxa" w:w="80"/>
+            </w:tcMar>
+          </w:tcPr>
+          <w:p>
+            <w:pPr>
+              <w:jc w:val="right"/>
+            </w:pPr>
+            <w:r>
+              <w:rPr>
+                <w:b w:val="false"/>
+                <w:bCs w:val="false"/>
+                <w:sz w:val="17"/>
+                <w:szCs w:val="17"/>
+              </w:rPr>
+              <w:t xml:space="preserve">+9%</w:t>
+            </w:r>
+          </w:p>
+        </w:tc>
+        <w:tc>
+          <w:tcPr>
+            <w:tcW w:type="dxa" w:w="800"/>
             <w:tcBorders>
               <w:top w:val="single" w:color="BFBFBF" w:sz="4"/>
               <w:left w:val="single" w:color="BFBFBF" w:sz="4"/>
@@ -5322,7 +5481,7 @@
         </w:tc>
         <w:tc>
           <w:tcPr>
-            <w:tcW w:type="dxa" w:w="800"/>
+            <w:tcW w:type="dxa" w:w="650"/>
             <w:tcBorders>
               <w:top w:val="single" w:color="BFBFBF" w:sz="4"/>
               <w:left w:val="single" w:color="BFBFBF" w:sz="4"/>
@@ -5353,32 +5512,32 @@
         </w:tc>
         <w:tc>
           <w:tcPr>
-            <w:tcW w:type="dxa" w:w="1776"/>
-            <w:tcBorders>
-              <w:top w:val="single" w:color="BFBFBF" w:sz="4"/>
-              <w:left w:val="single" w:color="BFBFBF" w:sz="4"/>
-              <w:bottom w:val="single" w:color="BFBFBF" w:sz="4"/>
-              <w:right w:val="single" w:color="BFBFBF" w:sz="4"/>
-            </w:tcBorders>
-            <w:tcMar>
-              <w:top w:type="dxa" w:w="40"/>
-              <w:left w:type="dxa" w:w="80"/>
-              <w:bottom w:type="dxa" w:w="40"/>
-              <w:right w:type="dxa" w:w="80"/>
-            </w:tcMar>
-          </w:tcPr>
-          <w:p>
-            <w:pPr>
-              <w:jc w:val="right"/>
-            </w:pPr>
-            <w:r>
-              <w:rPr>
-                <w:b w:val="false"/>
-                <w:bCs w:val="false"/>
-                <w:sz w:val="17"/>
-                <w:szCs w:val="17"/>
-              </w:rPr>
-              <w:t xml:space="preserve">22.0 / 23.1</w:t>
+            <w:tcW w:type="dxa" w:w="1526"/>
+            <w:tcBorders>
+              <w:top w:val="single" w:color="BFBFBF" w:sz="4"/>
+              <w:left w:val="single" w:color="BFBFBF" w:sz="4"/>
+              <w:bottom w:val="single" w:color="BFBFBF" w:sz="4"/>
+              <w:right w:val="single" w:color="BFBFBF" w:sz="4"/>
+            </w:tcBorders>
+            <w:tcMar>
+              <w:top w:type="dxa" w:w="40"/>
+              <w:left w:type="dxa" w:w="80"/>
+              <w:bottom w:type="dxa" w:w="40"/>
+              <w:right w:type="dxa" w:w="80"/>
+            </w:tcMar>
+          </w:tcPr>
+          <w:p>
+            <w:pPr>
+              <w:jc w:val="right"/>
+            </w:pPr>
+            <w:r>
+              <w:rPr>
+                <w:b w:val="false"/>
+                <w:bCs w:val="false"/>
+                <w:sz w:val="17"/>
+                <w:szCs w:val="17"/>
+              </w:rPr>
+              <w:t xml:space="preserve">22.0 / 23.1 (−4%)</w:t>
             </w:r>
           </w:p>
         </w:tc>
@@ -5386,7 +5545,7 @@
       <w:tr>
         <w:tc>
           <w:tcPr>
-            <w:tcW w:type="dxa" w:w="2500"/>
+            <w:tcW w:type="dxa" w:w="2050"/>
             <w:tcBorders>
               <w:top w:val="single" w:color="BFBFBF" w:sz="4"/>
               <w:left w:val="single" w:color="BFBFBF" w:sz="4"/>
@@ -5417,7 +5576,7 @@
         </w:tc>
         <w:tc>
           <w:tcPr>
-            <w:tcW w:type="dxa" w:w="950"/>
+            <w:tcW w:type="dxa" w:w="850"/>
             <w:tcBorders>
               <w:top w:val="single" w:color="BFBFBF" w:sz="4"/>
               <w:left w:val="single" w:color="BFBFBF" w:sz="4"/>
@@ -5448,69 +5607,100 @@
         </w:tc>
         <w:tc>
           <w:tcPr>
-            <w:tcW w:type="dxa" w:w="1000"/>
-            <w:tcBorders>
-              <w:top w:val="single" w:color="BFBFBF" w:sz="4"/>
-              <w:left w:val="single" w:color="BFBFBF" w:sz="4"/>
-              <w:bottom w:val="single" w:color="BFBFBF" w:sz="4"/>
-              <w:right w:val="single" w:color="BFBFBF" w:sz="4"/>
-            </w:tcBorders>
-            <w:tcMar>
-              <w:top w:type="dxa" w:w="40"/>
-              <w:left w:type="dxa" w:w="80"/>
-              <w:bottom w:type="dxa" w:w="40"/>
-              <w:right w:type="dxa" w:w="80"/>
-            </w:tcMar>
-          </w:tcPr>
-          <w:p>
-            <w:pPr>
-              <w:jc w:val="right"/>
-            </w:pPr>
-            <w:r>
-              <w:rPr>
-                <w:b w:val="false"/>
-                <w:bCs w:val="false"/>
-                <w:sz w:val="17"/>
-                <w:szCs w:val="17"/>
-              </w:rPr>
-              <w:t xml:space="preserve">−6.6</w:t>
-            </w:r>
-          </w:p>
-        </w:tc>
-        <w:tc>
-          <w:tcPr>
-            <w:tcW w:type="dxa" w:w="1050"/>
-            <w:tcBorders>
-              <w:top w:val="single" w:color="BFBFBF" w:sz="4"/>
-              <w:left w:val="single" w:color="BFBFBF" w:sz="4"/>
-              <w:bottom w:val="single" w:color="BFBFBF" w:sz="4"/>
-              <w:right w:val="single" w:color="BFBFBF" w:sz="4"/>
-            </w:tcBorders>
-            <w:tcMar>
-              <w:top w:type="dxa" w:w="40"/>
-              <w:left w:type="dxa" w:w="80"/>
-              <w:bottom w:type="dxa" w:w="40"/>
-              <w:right w:type="dxa" w:w="80"/>
-            </w:tcMar>
-          </w:tcPr>
-          <w:p>
-            <w:pPr>
-              <w:jc w:val="right"/>
-            </w:pPr>
-            <w:r>
-              <w:rPr>
-                <w:b w:val="false"/>
-                <w:bCs w:val="false"/>
-                <w:sz w:val="17"/>
-                <w:szCs w:val="17"/>
-              </w:rPr>
-              <w:t xml:space="preserve">33.7</w:t>
-            </w:r>
-          </w:p>
-        </w:tc>
-        <w:tc>
-          <w:tcPr>
-            <w:tcW w:type="dxa" w:w="950"/>
+            <w:tcW w:type="dxa" w:w="1150"/>
+            <w:tcBorders>
+              <w:top w:val="single" w:color="BFBFBF" w:sz="4"/>
+              <w:left w:val="single" w:color="BFBFBF" w:sz="4"/>
+              <w:bottom w:val="single" w:color="BFBFBF" w:sz="4"/>
+              <w:right w:val="single" w:color="BFBFBF" w:sz="4"/>
+            </w:tcBorders>
+            <w:tcMar>
+              <w:top w:type="dxa" w:w="40"/>
+              <w:left w:type="dxa" w:w="80"/>
+              <w:bottom w:type="dxa" w:w="40"/>
+              <w:right w:type="dxa" w:w="80"/>
+            </w:tcMar>
+          </w:tcPr>
+          <w:p>
+            <w:pPr>
+              <w:jc w:val="right"/>
+            </w:pPr>
+            <w:r>
+              <w:rPr>
+                <w:b w:val="false"/>
+                <w:bCs w:val="false"/>
+                <w:sz w:val="17"/>
+                <w:szCs w:val="17"/>
+              </w:rPr>
+              <w:t xml:space="preserve">−6.6 (−6%)</w:t>
+            </w:r>
+          </w:p>
+        </w:tc>
+        <w:tc>
+          <w:tcPr>
+            <w:tcW w:type="dxa" w:w="1150"/>
+            <w:tcBorders>
+              <w:top w:val="single" w:color="BFBFBF" w:sz="4"/>
+              <w:left w:val="single" w:color="BFBFBF" w:sz="4"/>
+              <w:bottom w:val="single" w:color="BFBFBF" w:sz="4"/>
+              <w:right w:val="single" w:color="BFBFBF" w:sz="4"/>
+            </w:tcBorders>
+            <w:tcMar>
+              <w:top w:type="dxa" w:w="40"/>
+              <w:left w:type="dxa" w:w="80"/>
+              <w:bottom w:type="dxa" w:w="40"/>
+              <w:right w:type="dxa" w:w="80"/>
+            </w:tcMar>
+          </w:tcPr>
+          <w:p>
+            <w:pPr>
+              <w:jc w:val="right"/>
+            </w:pPr>
+            <w:r>
+              <w:rPr>
+                <w:b w:val="false"/>
+                <w:bCs w:val="false"/>
+                <w:sz w:val="17"/>
+                <w:szCs w:val="17"/>
+              </w:rPr>
+              <w:t xml:space="preserve">33.7 (33%)</w:t>
+            </w:r>
+          </w:p>
+        </w:tc>
+        <w:tc>
+          <w:tcPr>
+            <w:tcW w:type="dxa" w:w="850"/>
+            <w:tcBorders>
+              <w:top w:val="single" w:color="BFBFBF" w:sz="4"/>
+              <w:left w:val="single" w:color="BFBFBF" w:sz="4"/>
+              <w:bottom w:val="single" w:color="BFBFBF" w:sz="4"/>
+              <w:right w:val="single" w:color="BFBFBF" w:sz="4"/>
+            </w:tcBorders>
+            <w:tcMar>
+              <w:top w:type="dxa" w:w="40"/>
+              <w:left w:type="dxa" w:w="80"/>
+              <w:bottom w:type="dxa" w:w="40"/>
+              <w:right w:type="dxa" w:w="80"/>
+            </w:tcMar>
+          </w:tcPr>
+          <w:p>
+            <w:pPr>
+              <w:jc w:val="right"/>
+            </w:pPr>
+            <w:r>
+              <w:rPr>
+                <w:b w:val="false"/>
+                <w:bCs w:val="false"/>
+                <w:sz w:val="17"/>
+                <w:szCs w:val="17"/>
+              </w:rPr>
+              <w:t xml:space="preserve">−11%</w:t>
+            </w:r>
+          </w:p>
+        </w:tc>
+        <w:tc>
+          <w:tcPr>
+            <w:tcW w:type="dxa" w:w="800"/>
             <w:tcBorders>
               <w:top w:val="single" w:color="BFBFBF" w:sz="4"/>
               <w:left w:val="single" w:color="BFBFBF" w:sz="4"/>
@@ -5541,7 +5731,7 @@
         </w:tc>
         <w:tc>
           <w:tcPr>
-            <w:tcW w:type="dxa" w:w="800"/>
+            <w:tcW w:type="dxa" w:w="650"/>
             <w:tcBorders>
               <w:top w:val="single" w:color="BFBFBF" w:sz="4"/>
               <w:left w:val="single" w:color="BFBFBF" w:sz="4"/>
@@ -5572,32 +5762,32 @@
         </w:tc>
         <w:tc>
           <w:tcPr>
-            <w:tcW w:type="dxa" w:w="1776"/>
-            <w:tcBorders>
-              <w:top w:val="single" w:color="BFBFBF" w:sz="4"/>
-              <w:left w:val="single" w:color="BFBFBF" w:sz="4"/>
-              <w:bottom w:val="single" w:color="BFBFBF" w:sz="4"/>
-              <w:right w:val="single" w:color="BFBFBF" w:sz="4"/>
-            </w:tcBorders>
-            <w:tcMar>
-              <w:top w:type="dxa" w:w="40"/>
-              <w:left w:type="dxa" w:w="80"/>
-              <w:bottom w:type="dxa" w:w="40"/>
-              <w:right w:type="dxa" w:w="80"/>
-            </w:tcMar>
-          </w:tcPr>
-          <w:p>
-            <w:pPr>
-              <w:jc w:val="right"/>
-            </w:pPr>
-            <w:r>
-              <w:rPr>
-                <w:b w:val="false"/>
-                <w:bCs w:val="false"/>
-                <w:sz w:val="17"/>
-                <w:szCs w:val="17"/>
-              </w:rPr>
-              <w:t xml:space="preserve">19.0 / 24.4</w:t>
+            <w:tcW w:type="dxa" w:w="1526"/>
+            <w:tcBorders>
+              <w:top w:val="single" w:color="BFBFBF" w:sz="4"/>
+              <w:left w:val="single" w:color="BFBFBF" w:sz="4"/>
+              <w:bottom w:val="single" w:color="BFBFBF" w:sz="4"/>
+              <w:right w:val="single" w:color="BFBFBF" w:sz="4"/>
+            </w:tcBorders>
+            <w:tcMar>
+              <w:top w:type="dxa" w:w="40"/>
+              <w:left w:type="dxa" w:w="80"/>
+              <w:bottom w:type="dxa" w:w="40"/>
+              <w:right w:type="dxa" w:w="80"/>
+            </w:tcMar>
+          </w:tcPr>
+          <w:p>
+            <w:pPr>
+              <w:jc w:val="right"/>
+            </w:pPr>
+            <w:r>
+              <w:rPr>
+                <w:b w:val="false"/>
+                <w:bCs w:val="false"/>
+                <w:sz w:val="17"/>
+                <w:szCs w:val="17"/>
+              </w:rPr>
+              <w:t xml:space="preserve">19.0 / 24.4 (−22%)</w:t>
             </w:r>
           </w:p>
         </w:tc>
@@ -5605,7 +5795,7 @@
       <w:tr>
         <w:tc>
           <w:tcPr>
-            <w:tcW w:type="dxa" w:w="2500"/>
+            <w:tcW w:type="dxa" w:w="2050"/>
             <w:tcBorders>
               <w:top w:val="single" w:color="BFBFBF" w:sz="4"/>
               <w:left w:val="single" w:color="BFBFBF" w:sz="4"/>
@@ -5636,100 +5826,131 @@
         </w:tc>
         <w:tc>
           <w:tcPr>
-            <w:tcW w:type="dxa" w:w="950"/>
-            <w:tcBorders>
-              <w:top w:val="single" w:color="BFBFBF" w:sz="4"/>
-              <w:left w:val="single" w:color="BFBFBF" w:sz="4"/>
-              <w:bottom w:val="single" w:color="BFBFBF" w:sz="4"/>
-              <w:right w:val="single" w:color="BFBFBF" w:sz="4"/>
-            </w:tcBorders>
-            <w:tcMar>
-              <w:top w:type="dxa" w:w="40"/>
-              <w:left w:type="dxa" w:w="80"/>
-              <w:bottom w:type="dxa" w:w="40"/>
-              <w:right w:type="dxa" w:w="80"/>
-            </w:tcMar>
-          </w:tcPr>
-          <w:p>
-            <w:pPr>
-              <w:jc w:val="right"/>
-            </w:pPr>
-            <w:r>
-              <w:rPr>
-                <w:b w:val="false"/>
-                <w:bCs w:val="false"/>
-                <w:sz w:val="17"/>
-                <w:szCs w:val="17"/>
-              </w:rPr>
-              <w:t xml:space="preserve">576,383</w:t>
-            </w:r>
-          </w:p>
-        </w:tc>
-        <w:tc>
-          <w:tcPr>
-            <w:tcW w:type="dxa" w:w="1000"/>
-            <w:tcBorders>
-              <w:top w:val="single" w:color="BFBFBF" w:sz="4"/>
-              <w:left w:val="single" w:color="BFBFBF" w:sz="4"/>
-              <w:bottom w:val="single" w:color="BFBFBF" w:sz="4"/>
-              <w:right w:val="single" w:color="BFBFBF" w:sz="4"/>
-            </w:tcBorders>
-            <w:tcMar>
-              <w:top w:type="dxa" w:w="40"/>
-              <w:left w:type="dxa" w:w="80"/>
-              <w:bottom w:type="dxa" w:w="40"/>
-              <w:right w:type="dxa" w:w="80"/>
-            </w:tcMar>
-          </w:tcPr>
-          <w:p>
-            <w:pPr>
-              <w:jc w:val="right"/>
-            </w:pPr>
-            <w:r>
-              <w:rPr>
-                <w:b w:val="false"/>
-                <w:bCs w:val="false"/>
-                <w:sz w:val="17"/>
-                <w:szCs w:val="17"/>
-              </w:rPr>
-              <w:t xml:space="preserve">68.1</w:t>
-            </w:r>
-          </w:p>
-        </w:tc>
-        <w:tc>
-          <w:tcPr>
-            <w:tcW w:type="dxa" w:w="1050"/>
-            <w:tcBorders>
-              <w:top w:val="single" w:color="BFBFBF" w:sz="4"/>
-              <w:left w:val="single" w:color="BFBFBF" w:sz="4"/>
-              <w:bottom w:val="single" w:color="BFBFBF" w:sz="4"/>
-              <w:right w:val="single" w:color="BFBFBF" w:sz="4"/>
-            </w:tcBorders>
-            <w:tcMar>
-              <w:top w:type="dxa" w:w="40"/>
-              <w:left w:type="dxa" w:w="80"/>
-              <w:bottom w:type="dxa" w:w="40"/>
-              <w:right w:type="dxa" w:w="80"/>
-            </w:tcMar>
-          </w:tcPr>
-          <w:p>
-            <w:pPr>
-              <w:jc w:val="right"/>
-            </w:pPr>
-            <w:r>
-              <w:rPr>
-                <w:b w:val="false"/>
-                <w:bCs w:val="false"/>
-                <w:sz w:val="17"/>
-                <w:szCs w:val="17"/>
-              </w:rPr>
-              <w:t xml:space="preserve">73.7</w:t>
-            </w:r>
-          </w:p>
-        </w:tc>
-        <w:tc>
-          <w:tcPr>
-            <w:tcW w:type="dxa" w:w="950"/>
+            <w:tcW w:type="dxa" w:w="850"/>
+            <w:tcBorders>
+              <w:top w:val="single" w:color="BFBFBF" w:sz="4"/>
+              <w:left w:val="single" w:color="BFBFBF" w:sz="4"/>
+              <w:bottom w:val="single" w:color="BFBFBF" w:sz="4"/>
+              <w:right w:val="single" w:color="BFBFBF" w:sz="4"/>
+            </w:tcBorders>
+            <w:tcMar>
+              <w:top w:type="dxa" w:w="40"/>
+              <w:left w:type="dxa" w:w="80"/>
+              <w:bottom w:type="dxa" w:w="40"/>
+              <w:right w:type="dxa" w:w="80"/>
+            </w:tcMar>
+          </w:tcPr>
+          <w:p>
+            <w:pPr>
+              <w:jc w:val="right"/>
+            </w:pPr>
+            <w:r>
+              <w:rPr>
+                <w:b w:val="false"/>
+                <w:bCs w:val="false"/>
+                <w:sz w:val="17"/>
+                <w:szCs w:val="17"/>
+              </w:rPr>
+              <w:t xml:space="preserve">576,631</w:t>
+            </w:r>
+          </w:p>
+        </w:tc>
+        <w:tc>
+          <w:tcPr>
+            <w:tcW w:type="dxa" w:w="1150"/>
+            <w:tcBorders>
+              <w:top w:val="single" w:color="BFBFBF" w:sz="4"/>
+              <w:left w:val="single" w:color="BFBFBF" w:sz="4"/>
+              <w:bottom w:val="single" w:color="BFBFBF" w:sz="4"/>
+              <w:right w:val="single" w:color="BFBFBF" w:sz="4"/>
+            </w:tcBorders>
+            <w:tcMar>
+              <w:top w:type="dxa" w:w="40"/>
+              <w:left w:type="dxa" w:w="80"/>
+              <w:bottom w:type="dxa" w:w="40"/>
+              <w:right w:type="dxa" w:w="80"/>
+            </w:tcMar>
+          </w:tcPr>
+          <w:p>
+            <w:pPr>
+              <w:jc w:val="right"/>
+            </w:pPr>
+            <w:r>
+              <w:rPr>
+                <w:b w:val="false"/>
+                <w:bCs w:val="false"/>
+                <w:sz w:val="17"/>
+                <w:szCs w:val="17"/>
+              </w:rPr>
+              <w:t xml:space="preserve">+68.0 (+107%)</w:t>
+            </w:r>
+          </w:p>
+        </w:tc>
+        <w:tc>
+          <w:tcPr>
+            <w:tcW w:type="dxa" w:w="1150"/>
+            <w:tcBorders>
+              <w:top w:val="single" w:color="BFBFBF" w:sz="4"/>
+              <w:left w:val="single" w:color="BFBFBF" w:sz="4"/>
+              <w:bottom w:val="single" w:color="BFBFBF" w:sz="4"/>
+              <w:right w:val="single" w:color="BFBFBF" w:sz="4"/>
+            </w:tcBorders>
+            <w:tcMar>
+              <w:top w:type="dxa" w:w="40"/>
+              <w:left w:type="dxa" w:w="80"/>
+              <w:bottom w:type="dxa" w:w="40"/>
+              <w:right w:type="dxa" w:w="80"/>
+            </w:tcMar>
+          </w:tcPr>
+          <w:p>
+            <w:pPr>
+              <w:jc w:val="right"/>
+            </w:pPr>
+            <w:r>
+              <w:rPr>
+                <w:b w:val="false"/>
+                <w:bCs w:val="false"/>
+                <w:sz w:val="17"/>
+                <w:szCs w:val="17"/>
+              </w:rPr>
+              <w:t xml:space="preserve">73.6 (116%)</w:t>
+            </w:r>
+          </w:p>
+        </w:tc>
+        <w:tc>
+          <w:tcPr>
+            <w:tcW w:type="dxa" w:w="850"/>
+            <w:tcBorders>
+              <w:top w:val="single" w:color="BFBFBF" w:sz="4"/>
+              <w:left w:val="single" w:color="BFBFBF" w:sz="4"/>
+              <w:bottom w:val="single" w:color="BFBFBF" w:sz="4"/>
+              <w:right w:val="single" w:color="BFBFBF" w:sz="4"/>
+            </w:tcBorders>
+            <w:tcMar>
+              <w:top w:type="dxa" w:w="40"/>
+              <w:left w:type="dxa" w:w="80"/>
+              <w:bottom w:type="dxa" w:w="40"/>
+              <w:right w:type="dxa" w:w="80"/>
+            </w:tcMar>
+          </w:tcPr>
+          <w:p>
+            <w:pPr>
+              <w:jc w:val="right"/>
+            </w:pPr>
+            <w:r>
+              <w:rPr>
+                <w:b w:val="false"/>
+                <w:bCs w:val="false"/>
+                <w:sz w:val="17"/>
+                <w:szCs w:val="17"/>
+              </w:rPr>
+              <w:t xml:space="preserve">+67%</w:t>
+            </w:r>
+          </w:p>
+        </w:tc>
+        <w:tc>
+          <w:tcPr>
+            <w:tcW w:type="dxa" w:w="800"/>
             <w:tcBorders>
               <w:top w:val="single" w:color="BFBFBF" w:sz="4"/>
               <w:left w:val="single" w:color="BFBFBF" w:sz="4"/>
@@ -5760,7 +5981,7 @@
         </w:tc>
         <w:tc>
           <w:tcPr>
-            <w:tcW w:type="dxa" w:w="800"/>
+            <w:tcW w:type="dxa" w:w="650"/>
             <w:tcBorders>
               <w:top w:val="single" w:color="BFBFBF" w:sz="4"/>
               <w:left w:val="single" w:color="BFBFBF" w:sz="4"/>
@@ -5791,32 +6012,32 @@
         </w:tc>
         <w:tc>
           <w:tcPr>
-            <w:tcW w:type="dxa" w:w="1776"/>
-            <w:tcBorders>
-              <w:top w:val="single" w:color="BFBFBF" w:sz="4"/>
-              <w:left w:val="single" w:color="BFBFBF" w:sz="4"/>
-              <w:bottom w:val="single" w:color="BFBFBF" w:sz="4"/>
-              <w:right w:val="single" w:color="BFBFBF" w:sz="4"/>
-            </w:tcBorders>
-            <w:tcMar>
-              <w:top w:type="dxa" w:w="40"/>
-              <w:left w:type="dxa" w:w="80"/>
-              <w:bottom w:type="dxa" w:w="40"/>
-              <w:right w:type="dxa" w:w="80"/>
-            </w:tcMar>
-          </w:tcPr>
-          <w:p>
-            <w:pPr>
-              <w:jc w:val="right"/>
-            </w:pPr>
-            <w:r>
-              <w:rPr>
-                <w:b w:val="false"/>
-                <w:bCs w:val="false"/>
-                <w:sz w:val="17"/>
-                <w:szCs w:val="17"/>
-              </w:rPr>
-              <w:t xml:space="preserve">15.8 / 7.9</w:t>
+            <w:tcW w:type="dxa" w:w="1526"/>
+            <w:tcBorders>
+              <w:top w:val="single" w:color="BFBFBF" w:sz="4"/>
+              <w:left w:val="single" w:color="BFBFBF" w:sz="4"/>
+              <w:bottom w:val="single" w:color="BFBFBF" w:sz="4"/>
+              <w:right w:val="single" w:color="BFBFBF" w:sz="4"/>
+            </w:tcBorders>
+            <w:tcMar>
+              <w:top w:type="dxa" w:w="40"/>
+              <w:left w:type="dxa" w:w="80"/>
+              <w:bottom w:type="dxa" w:w="40"/>
+              <w:right w:type="dxa" w:w="80"/>
+            </w:tcMar>
+          </w:tcPr>
+          <w:p>
+            <w:pPr>
+              <w:jc w:val="right"/>
+            </w:pPr>
+            <w:r>
+              <w:rPr>
+                <w:b w:val="false"/>
+                <w:bCs w:val="false"/>
+                <w:sz w:val="17"/>
+                <w:szCs w:val="17"/>
+              </w:rPr>
+              <w:t xml:space="preserve">15.9 / 7.9 (+101%)</w:t>
             </w:r>
           </w:p>
         </w:tc>
@@ -5824,7 +6045,7 @@
       <w:tr>
         <w:tc>
           <w:tcPr>
-            <w:tcW w:type="dxa" w:w="2500"/>
+            <w:tcW w:type="dxa" w:w="2050"/>
             <w:tcBorders>
               <w:top w:val="single" w:color="BFBFBF" w:sz="4"/>
               <w:left w:val="single" w:color="BFBFBF" w:sz="4"/>
@@ -5855,7 +6076,7 @@
         </w:tc>
         <w:tc>
           <w:tcPr>
-            <w:tcW w:type="dxa" w:w="950"/>
+            <w:tcW w:type="dxa" w:w="850"/>
             <w:tcBorders>
               <w:top w:val="single" w:color="BFBFBF" w:sz="4"/>
               <w:left w:val="single" w:color="BFBFBF" w:sz="4"/>
@@ -5886,69 +6107,100 @@
         </w:tc>
         <w:tc>
           <w:tcPr>
-            <w:tcW w:type="dxa" w:w="1000"/>
-            <w:tcBorders>
-              <w:top w:val="single" w:color="BFBFBF" w:sz="4"/>
-              <w:left w:val="single" w:color="BFBFBF" w:sz="4"/>
-              <w:bottom w:val="single" w:color="BFBFBF" w:sz="4"/>
-              <w:right w:val="single" w:color="BFBFBF" w:sz="4"/>
-            </w:tcBorders>
-            <w:tcMar>
-              <w:top w:type="dxa" w:w="40"/>
-              <w:left w:type="dxa" w:w="80"/>
-              <w:bottom w:type="dxa" w:w="40"/>
-              <w:right w:type="dxa" w:w="80"/>
-            </w:tcMar>
-          </w:tcPr>
-          <w:p>
-            <w:pPr>
-              <w:jc w:val="right"/>
-            </w:pPr>
-            <w:r>
-              <w:rPr>
-                <w:b w:val="false"/>
-                <w:bCs w:val="false"/>
-                <w:sz w:val="17"/>
-                <w:szCs w:val="17"/>
-              </w:rPr>
-              <w:t xml:space="preserve">19.9</w:t>
-            </w:r>
-          </w:p>
-        </w:tc>
-        <w:tc>
-          <w:tcPr>
-            <w:tcW w:type="dxa" w:w="1050"/>
-            <w:tcBorders>
-              <w:top w:val="single" w:color="BFBFBF" w:sz="4"/>
-              <w:left w:val="single" w:color="BFBFBF" w:sz="4"/>
-              <w:bottom w:val="single" w:color="BFBFBF" w:sz="4"/>
-              <w:right w:val="single" w:color="BFBFBF" w:sz="4"/>
-            </w:tcBorders>
-            <w:tcMar>
-              <w:top w:type="dxa" w:w="40"/>
-              <w:left w:type="dxa" w:w="80"/>
-              <w:bottom w:type="dxa" w:w="40"/>
-              <w:right w:type="dxa" w:w="80"/>
-            </w:tcMar>
-          </w:tcPr>
-          <w:p>
-            <w:pPr>
-              <w:jc w:val="right"/>
-            </w:pPr>
-            <w:r>
-              <w:rPr>
-                <w:b w:val="false"/>
-                <w:bCs w:val="false"/>
-                <w:sz w:val="17"/>
-                <w:szCs w:val="17"/>
-              </w:rPr>
-              <w:t xml:space="preserve">27.5</w:t>
-            </w:r>
-          </w:p>
-        </w:tc>
-        <w:tc>
-          <w:tcPr>
-            <w:tcW w:type="dxa" w:w="950"/>
+            <w:tcW w:type="dxa" w:w="1150"/>
+            <w:tcBorders>
+              <w:top w:val="single" w:color="BFBFBF" w:sz="4"/>
+              <w:left w:val="single" w:color="BFBFBF" w:sz="4"/>
+              <w:bottom w:val="single" w:color="BFBFBF" w:sz="4"/>
+              <w:right w:val="single" w:color="BFBFBF" w:sz="4"/>
+            </w:tcBorders>
+            <w:tcMar>
+              <w:top w:type="dxa" w:w="40"/>
+              <w:left w:type="dxa" w:w="80"/>
+              <w:bottom w:type="dxa" w:w="40"/>
+              <w:right w:type="dxa" w:w="80"/>
+            </w:tcMar>
+          </w:tcPr>
+          <w:p>
+            <w:pPr>
+              <w:jc w:val="right"/>
+            </w:pPr>
+            <w:r>
+              <w:rPr>
+                <w:b w:val="false"/>
+                <w:bCs w:val="false"/>
+                <w:sz w:val="17"/>
+                <w:szCs w:val="17"/>
+              </w:rPr>
+              <w:t xml:space="preserve">+19.9 (+31%)</w:t>
+            </w:r>
+          </w:p>
+        </w:tc>
+        <w:tc>
+          <w:tcPr>
+            <w:tcW w:type="dxa" w:w="1150"/>
+            <w:tcBorders>
+              <w:top w:val="single" w:color="BFBFBF" w:sz="4"/>
+              <w:left w:val="single" w:color="BFBFBF" w:sz="4"/>
+              <w:bottom w:val="single" w:color="BFBFBF" w:sz="4"/>
+              <w:right w:val="single" w:color="BFBFBF" w:sz="4"/>
+            </w:tcBorders>
+            <w:tcMar>
+              <w:top w:type="dxa" w:w="40"/>
+              <w:left w:type="dxa" w:w="80"/>
+              <w:bottom w:type="dxa" w:w="40"/>
+              <w:right w:type="dxa" w:w="80"/>
+            </w:tcMar>
+          </w:tcPr>
+          <w:p>
+            <w:pPr>
+              <w:jc w:val="right"/>
+            </w:pPr>
+            <w:r>
+              <w:rPr>
+                <w:b w:val="false"/>
+                <w:bCs w:val="false"/>
+                <w:sz w:val="17"/>
+                <w:szCs w:val="17"/>
+              </w:rPr>
+              <w:t xml:space="preserve">27.5 (43%)</w:t>
+            </w:r>
+          </w:p>
+        </w:tc>
+        <w:tc>
+          <w:tcPr>
+            <w:tcW w:type="dxa" w:w="850"/>
+            <w:tcBorders>
+              <w:top w:val="single" w:color="BFBFBF" w:sz="4"/>
+              <w:left w:val="single" w:color="BFBFBF" w:sz="4"/>
+              <w:bottom w:val="single" w:color="BFBFBF" w:sz="4"/>
+              <w:right w:val="single" w:color="BFBFBF" w:sz="4"/>
+            </w:tcBorders>
+            <w:tcMar>
+              <w:top w:type="dxa" w:w="40"/>
+              <w:left w:type="dxa" w:w="80"/>
+              <w:bottom w:type="dxa" w:w="40"/>
+              <w:right w:type="dxa" w:w="80"/>
+            </w:tcMar>
+          </w:tcPr>
+          <w:p>
+            <w:pPr>
+              <w:jc w:val="right"/>
+            </w:pPr>
+            <w:r>
+              <w:rPr>
+                <w:b w:val="false"/>
+                <w:bCs w:val="false"/>
+                <w:sz w:val="17"/>
+                <w:szCs w:val="17"/>
+              </w:rPr>
+              <w:t xml:space="preserve">+19%</w:t>
+            </w:r>
+          </w:p>
+        </w:tc>
+        <w:tc>
+          <w:tcPr>
+            <w:tcW w:type="dxa" w:w="800"/>
             <w:tcBorders>
               <w:top w:val="single" w:color="BFBFBF" w:sz="4"/>
               <w:left w:val="single" w:color="BFBFBF" w:sz="4"/>
@@ -5979,7 +6231,7 @@
         </w:tc>
         <w:tc>
           <w:tcPr>
-            <w:tcW w:type="dxa" w:w="800"/>
+            <w:tcW w:type="dxa" w:w="650"/>
             <w:tcBorders>
               <w:top w:val="single" w:color="BFBFBF" w:sz="4"/>
               <w:left w:val="single" w:color="BFBFBF" w:sz="4"/>
@@ -6010,32 +6262,32 @@
         </w:tc>
         <w:tc>
           <w:tcPr>
-            <w:tcW w:type="dxa" w:w="1776"/>
-            <w:tcBorders>
-              <w:top w:val="single" w:color="BFBFBF" w:sz="4"/>
-              <w:left w:val="single" w:color="BFBFBF" w:sz="4"/>
-              <w:bottom w:val="single" w:color="BFBFBF" w:sz="4"/>
-              <w:right w:val="single" w:color="BFBFBF" w:sz="4"/>
-            </w:tcBorders>
-            <w:tcMar>
-              <w:top w:type="dxa" w:w="40"/>
-              <w:left w:type="dxa" w:w="80"/>
-              <w:bottom w:type="dxa" w:w="40"/>
-              <w:right w:type="dxa" w:w="80"/>
-            </w:tcMar>
-          </w:tcPr>
-          <w:p>
-            <w:pPr>
-              <w:jc w:val="right"/>
-            </w:pPr>
-            <w:r>
-              <w:rPr>
-                <w:b w:val="false"/>
-                <w:bCs w:val="false"/>
-                <w:sz w:val="17"/>
-                <w:szCs w:val="17"/>
-              </w:rPr>
-              <w:t xml:space="preserve">8.7 / 7.9</w:t>
+            <w:tcW w:type="dxa" w:w="1526"/>
+            <w:tcBorders>
+              <w:top w:val="single" w:color="BFBFBF" w:sz="4"/>
+              <w:left w:val="single" w:color="BFBFBF" w:sz="4"/>
+              <w:bottom w:val="single" w:color="BFBFBF" w:sz="4"/>
+              <w:right w:val="single" w:color="BFBFBF" w:sz="4"/>
+            </w:tcBorders>
+            <w:tcMar>
+              <w:top w:type="dxa" w:w="40"/>
+              <w:left w:type="dxa" w:w="80"/>
+              <w:bottom w:type="dxa" w:w="40"/>
+              <w:right w:type="dxa" w:w="80"/>
+            </w:tcMar>
+          </w:tcPr>
+          <w:p>
+            <w:pPr>
+              <w:jc w:val="right"/>
+            </w:pPr>
+            <w:r>
+              <w:rPr>
+                <w:b w:val="false"/>
+                <w:bCs w:val="false"/>
+                <w:sz w:val="17"/>
+                <w:szCs w:val="17"/>
+              </w:rPr>
+              <w:t xml:space="preserve">8.7 / 7.9 (+11%)</w:t>
             </w:r>
           </w:p>
         </w:tc>
@@ -6043,7 +6295,7 @@
       <w:tr>
         <w:tc>
           <w:tcPr>
-            <w:tcW w:type="dxa" w:w="2500"/>
+            <w:tcW w:type="dxa" w:w="2050"/>
             <w:tcBorders>
               <w:top w:val="single" w:color="BFBFBF" w:sz="4"/>
               <w:left w:val="single" w:color="BFBFBF" w:sz="4"/>
@@ -6074,7 +6326,7 @@
         </w:tc>
         <w:tc>
           <w:tcPr>
-            <w:tcW w:type="dxa" w:w="950"/>
+            <w:tcW w:type="dxa" w:w="850"/>
             <w:tcBorders>
               <w:top w:val="single" w:color="BFBFBF" w:sz="4"/>
               <w:left w:val="single" w:color="BFBFBF" w:sz="4"/>
@@ -6105,69 +6357,100 @@
         </w:tc>
         <w:tc>
           <w:tcPr>
-            <w:tcW w:type="dxa" w:w="1000"/>
-            <w:tcBorders>
-              <w:top w:val="single" w:color="BFBFBF" w:sz="4"/>
-              <w:left w:val="single" w:color="BFBFBF" w:sz="4"/>
-              <w:bottom w:val="single" w:color="BFBFBF" w:sz="4"/>
-              <w:right w:val="single" w:color="BFBFBF" w:sz="4"/>
-            </w:tcBorders>
-            <w:tcMar>
-              <w:top w:type="dxa" w:w="40"/>
-              <w:left w:type="dxa" w:w="80"/>
-              <w:bottom w:type="dxa" w:w="40"/>
-              <w:right w:type="dxa" w:w="80"/>
-            </w:tcMar>
-          </w:tcPr>
-          <w:p>
-            <w:pPr>
-              <w:jc w:val="right"/>
-            </w:pPr>
-            <w:r>
-              <w:rPr>
-                <w:b w:val="false"/>
-                <w:bCs w:val="false"/>
-                <w:sz w:val="17"/>
-                <w:szCs w:val="17"/>
-              </w:rPr>
-              <w:t xml:space="preserve">−3.8</w:t>
-            </w:r>
-          </w:p>
-        </w:tc>
-        <w:tc>
-          <w:tcPr>
-            <w:tcW w:type="dxa" w:w="1050"/>
-            <w:tcBorders>
-              <w:top w:val="single" w:color="BFBFBF" w:sz="4"/>
-              <w:left w:val="single" w:color="BFBFBF" w:sz="4"/>
-              <w:bottom w:val="single" w:color="BFBFBF" w:sz="4"/>
-              <w:right w:val="single" w:color="BFBFBF" w:sz="4"/>
-            </w:tcBorders>
-            <w:tcMar>
-              <w:top w:type="dxa" w:w="40"/>
-              <w:left w:type="dxa" w:w="80"/>
-              <w:bottom w:type="dxa" w:w="40"/>
-              <w:right w:type="dxa" w:w="80"/>
-            </w:tcMar>
-          </w:tcPr>
-          <w:p>
-            <w:pPr>
-              <w:jc w:val="right"/>
-            </w:pPr>
-            <w:r>
-              <w:rPr>
-                <w:b w:val="false"/>
-                <w:bCs w:val="false"/>
-                <w:sz w:val="17"/>
-                <w:szCs w:val="17"/>
-              </w:rPr>
-              <w:t xml:space="preserve">25.4</w:t>
-            </w:r>
-          </w:p>
-        </w:tc>
-        <w:tc>
-          <w:tcPr>
-            <w:tcW w:type="dxa" w:w="950"/>
+            <w:tcW w:type="dxa" w:w="1150"/>
+            <w:tcBorders>
+              <w:top w:val="single" w:color="BFBFBF" w:sz="4"/>
+              <w:left w:val="single" w:color="BFBFBF" w:sz="4"/>
+              <w:bottom w:val="single" w:color="BFBFBF" w:sz="4"/>
+              <w:right w:val="single" w:color="BFBFBF" w:sz="4"/>
+            </w:tcBorders>
+            <w:tcMar>
+              <w:top w:type="dxa" w:w="40"/>
+              <w:left w:type="dxa" w:w="80"/>
+              <w:bottom w:type="dxa" w:w="40"/>
+              <w:right w:type="dxa" w:w="80"/>
+            </w:tcMar>
+          </w:tcPr>
+          <w:p>
+            <w:pPr>
+              <w:jc w:val="right"/>
+            </w:pPr>
+            <w:r>
+              <w:rPr>
+                <w:b w:val="false"/>
+                <w:bCs w:val="false"/>
+                <w:sz w:val="17"/>
+                <w:szCs w:val="17"/>
+              </w:rPr>
+              <w:t xml:space="preserve">−3.8 (−6%)</w:t>
+            </w:r>
+          </w:p>
+        </w:tc>
+        <w:tc>
+          <w:tcPr>
+            <w:tcW w:type="dxa" w:w="1150"/>
+            <w:tcBorders>
+              <w:top w:val="single" w:color="BFBFBF" w:sz="4"/>
+              <w:left w:val="single" w:color="BFBFBF" w:sz="4"/>
+              <w:bottom w:val="single" w:color="BFBFBF" w:sz="4"/>
+              <w:right w:val="single" w:color="BFBFBF" w:sz="4"/>
+            </w:tcBorders>
+            <w:tcMar>
+              <w:top w:type="dxa" w:w="40"/>
+              <w:left w:type="dxa" w:w="80"/>
+              <w:bottom w:type="dxa" w:w="40"/>
+              <w:right w:type="dxa" w:w="80"/>
+            </w:tcMar>
+          </w:tcPr>
+          <w:p>
+            <w:pPr>
+              <w:jc w:val="right"/>
+            </w:pPr>
+            <w:r>
+              <w:rPr>
+                <w:b w:val="false"/>
+                <w:bCs w:val="false"/>
+                <w:sz w:val="17"/>
+                <w:szCs w:val="17"/>
+              </w:rPr>
+              <w:t xml:space="preserve">25.4 (40%)</w:t>
+            </w:r>
+          </w:p>
+        </w:tc>
+        <w:tc>
+          <w:tcPr>
+            <w:tcW w:type="dxa" w:w="850"/>
+            <w:tcBorders>
+              <w:top w:val="single" w:color="BFBFBF" w:sz="4"/>
+              <w:left w:val="single" w:color="BFBFBF" w:sz="4"/>
+              <w:bottom w:val="single" w:color="BFBFBF" w:sz="4"/>
+              <w:right w:val="single" w:color="BFBFBF" w:sz="4"/>
+            </w:tcBorders>
+            <w:tcMar>
+              <w:top w:type="dxa" w:w="40"/>
+              <w:left w:type="dxa" w:w="80"/>
+              <w:bottom w:type="dxa" w:w="40"/>
+              <w:right w:type="dxa" w:w="80"/>
+            </w:tcMar>
+          </w:tcPr>
+          <w:p>
+            <w:pPr>
+              <w:jc w:val="right"/>
+            </w:pPr>
+            <w:r>
+              <w:rPr>
+                <w:b w:val="false"/>
+                <w:bCs w:val="false"/>
+                <w:sz w:val="17"/>
+                <w:szCs w:val="17"/>
+              </w:rPr>
+              <w:t xml:space="preserve">−9%</w:t>
+            </w:r>
+          </w:p>
+        </w:tc>
+        <w:tc>
+          <w:tcPr>
+            <w:tcW w:type="dxa" w:w="800"/>
             <w:tcBorders>
               <w:top w:val="single" w:color="BFBFBF" w:sz="4"/>
               <w:left w:val="single" w:color="BFBFBF" w:sz="4"/>
@@ -6198,7 +6481,7 @@
         </w:tc>
         <w:tc>
           <w:tcPr>
-            <w:tcW w:type="dxa" w:w="800"/>
+            <w:tcW w:type="dxa" w:w="650"/>
             <w:tcBorders>
               <w:top w:val="single" w:color="BFBFBF" w:sz="4"/>
               <w:left w:val="single" w:color="BFBFBF" w:sz="4"/>
@@ -6229,32 +6512,32 @@
         </w:tc>
         <w:tc>
           <w:tcPr>
-            <w:tcW w:type="dxa" w:w="1776"/>
-            <w:tcBorders>
-              <w:top w:val="single" w:color="BFBFBF" w:sz="4"/>
-              <w:left w:val="single" w:color="BFBFBF" w:sz="4"/>
-              <w:bottom w:val="single" w:color="BFBFBF" w:sz="4"/>
-              <w:right w:val="single" w:color="BFBFBF" w:sz="4"/>
-            </w:tcBorders>
-            <w:tcMar>
-              <w:top w:type="dxa" w:w="40"/>
-              <w:left w:type="dxa" w:w="80"/>
-              <w:bottom w:type="dxa" w:w="40"/>
-              <w:right w:type="dxa" w:w="80"/>
-            </w:tcMar>
-          </w:tcPr>
-          <w:p>
-            <w:pPr>
-              <w:jc w:val="right"/>
-            </w:pPr>
-            <w:r>
-              <w:rPr>
-                <w:b w:val="false"/>
-                <w:bCs w:val="false"/>
-                <w:sz w:val="17"/>
-                <w:szCs w:val="17"/>
-              </w:rPr>
-              <w:t xml:space="preserve">6.4 / 9.1</w:t>
+            <w:tcW w:type="dxa" w:w="1526"/>
+            <w:tcBorders>
+              <w:top w:val="single" w:color="BFBFBF" w:sz="4"/>
+              <w:left w:val="single" w:color="BFBFBF" w:sz="4"/>
+              <w:bottom w:val="single" w:color="BFBFBF" w:sz="4"/>
+              <w:right w:val="single" w:color="BFBFBF" w:sz="4"/>
+            </w:tcBorders>
+            <w:tcMar>
+              <w:top w:type="dxa" w:w="40"/>
+              <w:left w:type="dxa" w:w="80"/>
+              <w:bottom w:type="dxa" w:w="40"/>
+              <w:right w:type="dxa" w:w="80"/>
+            </w:tcMar>
+          </w:tcPr>
+          <w:p>
+            <w:pPr>
+              <w:jc w:val="right"/>
+            </w:pPr>
+            <w:r>
+              <w:rPr>
+                <w:b w:val="false"/>
+                <w:bCs w:val="false"/>
+                <w:sz w:val="17"/>
+                <w:szCs w:val="17"/>
+              </w:rPr>
+              <w:t xml:space="preserve">6.4 / 9.1 (−30%)</w:t>
             </w:r>
           </w:p>
         </w:tc>
@@ -6262,7 +6545,7 @@
       <w:tr>
         <w:tc>
           <w:tcPr>
-            <w:tcW w:type="dxa" w:w="2500"/>
+            <w:tcW w:type="dxa" w:w="2050"/>
             <w:tcBorders>
               <w:top w:val="single" w:color="BFBFBF" w:sz="4"/>
               <w:left w:val="single" w:color="BFBFBF" w:sz="4"/>
@@ -6293,100 +6576,131 @@
         </w:tc>
         <w:tc>
           <w:tcPr>
-            <w:tcW w:type="dxa" w:w="950"/>
-            <w:tcBorders>
-              <w:top w:val="single" w:color="BFBFBF" w:sz="4"/>
-              <w:left w:val="single" w:color="BFBFBF" w:sz="4"/>
-              <w:bottom w:val="single" w:color="BFBFBF" w:sz="4"/>
-              <w:right w:val="single" w:color="BFBFBF" w:sz="4"/>
-            </w:tcBorders>
-            <w:tcMar>
-              <w:top w:type="dxa" w:w="40"/>
-              <w:left w:type="dxa" w:w="80"/>
-              <w:bottom w:type="dxa" w:w="40"/>
-              <w:right w:type="dxa" w:w="80"/>
-            </w:tcMar>
-          </w:tcPr>
-          <w:p>
-            <w:pPr>
-              <w:jc w:val="right"/>
-            </w:pPr>
-            <w:r>
-              <w:rPr>
-                <w:b w:val="false"/>
-                <w:bCs w:val="false"/>
-                <w:sz w:val="17"/>
-                <w:szCs w:val="17"/>
-              </w:rPr>
-              <w:t xml:space="preserve">576,251</w:t>
-            </w:r>
-          </w:p>
-        </w:tc>
-        <w:tc>
-          <w:tcPr>
-            <w:tcW w:type="dxa" w:w="1000"/>
-            <w:tcBorders>
-              <w:top w:val="single" w:color="BFBFBF" w:sz="4"/>
-              <w:left w:val="single" w:color="BFBFBF" w:sz="4"/>
-              <w:bottom w:val="single" w:color="BFBFBF" w:sz="4"/>
-              <w:right w:val="single" w:color="BFBFBF" w:sz="4"/>
-            </w:tcBorders>
-            <w:tcMar>
-              <w:top w:type="dxa" w:w="40"/>
-              <w:left w:type="dxa" w:w="80"/>
-              <w:bottom w:type="dxa" w:w="40"/>
-              <w:right w:type="dxa" w:w="80"/>
-            </w:tcMar>
-          </w:tcPr>
-          <w:p>
-            <w:pPr>
-              <w:jc w:val="right"/>
-            </w:pPr>
-            <w:r>
-              <w:rPr>
-                <w:b w:val="false"/>
-                <w:bCs w:val="false"/>
-                <w:sz w:val="17"/>
-                <w:szCs w:val="17"/>
-              </w:rPr>
-              <w:t xml:space="preserve">190.4</w:t>
-            </w:r>
-          </w:p>
-        </w:tc>
-        <w:tc>
-          <w:tcPr>
-            <w:tcW w:type="dxa" w:w="1050"/>
-            <w:tcBorders>
-              <w:top w:val="single" w:color="BFBFBF" w:sz="4"/>
-              <w:left w:val="single" w:color="BFBFBF" w:sz="4"/>
-              <w:bottom w:val="single" w:color="BFBFBF" w:sz="4"/>
-              <w:right w:val="single" w:color="BFBFBF" w:sz="4"/>
-            </w:tcBorders>
-            <w:tcMar>
-              <w:top w:type="dxa" w:w="40"/>
-              <w:left w:type="dxa" w:w="80"/>
-              <w:bottom w:type="dxa" w:w="40"/>
-              <w:right w:type="dxa" w:w="80"/>
-            </w:tcMar>
-          </w:tcPr>
-          <w:p>
-            <w:pPr>
-              <w:jc w:val="right"/>
-            </w:pPr>
-            <w:r>
-              <w:rPr>
-                <w:b w:val="false"/>
-                <w:bCs w:val="false"/>
-                <w:sz w:val="17"/>
-                <w:szCs w:val="17"/>
-              </w:rPr>
-              <w:t xml:space="preserve">192.6</w:t>
-            </w:r>
-          </w:p>
-        </w:tc>
-        <w:tc>
-          <w:tcPr>
-            <w:tcW w:type="dxa" w:w="950"/>
+            <w:tcW w:type="dxa" w:w="850"/>
+            <w:tcBorders>
+              <w:top w:val="single" w:color="BFBFBF" w:sz="4"/>
+              <w:left w:val="single" w:color="BFBFBF" w:sz="4"/>
+              <w:bottom w:val="single" w:color="BFBFBF" w:sz="4"/>
+              <w:right w:val="single" w:color="BFBFBF" w:sz="4"/>
+            </w:tcBorders>
+            <w:tcMar>
+              <w:top w:type="dxa" w:w="40"/>
+              <w:left w:type="dxa" w:w="80"/>
+              <w:bottom w:type="dxa" w:w="40"/>
+              <w:right w:type="dxa" w:w="80"/>
+            </w:tcMar>
+          </w:tcPr>
+          <w:p>
+            <w:pPr>
+              <w:jc w:val="right"/>
+            </w:pPr>
+            <w:r>
+              <w:rPr>
+                <w:b w:val="false"/>
+                <w:bCs w:val="false"/>
+                <w:sz w:val="17"/>
+                <w:szCs w:val="17"/>
+              </w:rPr>
+              <w:t xml:space="preserve">576,522</w:t>
+            </w:r>
+          </w:p>
+        </w:tc>
+        <w:tc>
+          <w:tcPr>
+            <w:tcW w:type="dxa" w:w="1150"/>
+            <w:tcBorders>
+              <w:top w:val="single" w:color="BFBFBF" w:sz="4"/>
+              <w:left w:val="single" w:color="BFBFBF" w:sz="4"/>
+              <w:bottom w:val="single" w:color="BFBFBF" w:sz="4"/>
+              <w:right w:val="single" w:color="BFBFBF" w:sz="4"/>
+            </w:tcBorders>
+            <w:tcMar>
+              <w:top w:type="dxa" w:w="40"/>
+              <w:left w:type="dxa" w:w="80"/>
+              <w:bottom w:type="dxa" w:w="40"/>
+              <w:right w:type="dxa" w:w="80"/>
+            </w:tcMar>
+          </w:tcPr>
+          <w:p>
+            <w:pPr>
+              <w:jc w:val="right"/>
+            </w:pPr>
+            <w:r>
+              <w:rPr>
+                <w:b w:val="false"/>
+                <w:bCs w:val="false"/>
+                <w:sz w:val="17"/>
+                <w:szCs w:val="17"/>
+              </w:rPr>
+              <w:t xml:space="preserve">+190.0 (+43%)</w:t>
+            </w:r>
+          </w:p>
+        </w:tc>
+        <w:tc>
+          <w:tcPr>
+            <w:tcW w:type="dxa" w:w="1150"/>
+            <w:tcBorders>
+              <w:top w:val="single" w:color="BFBFBF" w:sz="4"/>
+              <w:left w:val="single" w:color="BFBFBF" w:sz="4"/>
+              <w:bottom w:val="single" w:color="BFBFBF" w:sz="4"/>
+              <w:right w:val="single" w:color="BFBFBF" w:sz="4"/>
+            </w:tcBorders>
+            <w:tcMar>
+              <w:top w:type="dxa" w:w="40"/>
+              <w:left w:type="dxa" w:w="80"/>
+              <w:bottom w:type="dxa" w:w="40"/>
+              <w:right w:type="dxa" w:w="80"/>
+            </w:tcMar>
+          </w:tcPr>
+          <w:p>
+            <w:pPr>
+              <w:jc w:val="right"/>
+            </w:pPr>
+            <w:r>
+              <w:rPr>
+                <w:b w:val="false"/>
+                <w:bCs w:val="false"/>
+                <w:sz w:val="17"/>
+                <w:szCs w:val="17"/>
+              </w:rPr>
+              <w:t xml:space="preserve">192.3 (43%)</w:t>
+            </w:r>
+          </w:p>
+        </w:tc>
+        <w:tc>
+          <w:tcPr>
+            <w:tcW w:type="dxa" w:w="850"/>
+            <w:tcBorders>
+              <w:top w:val="single" w:color="BFBFBF" w:sz="4"/>
+              <w:left w:val="single" w:color="BFBFBF" w:sz="4"/>
+              <w:bottom w:val="single" w:color="BFBFBF" w:sz="4"/>
+              <w:right w:val="single" w:color="BFBFBF" w:sz="4"/>
+            </w:tcBorders>
+            <w:tcMar>
+              <w:top w:type="dxa" w:w="40"/>
+              <w:left w:type="dxa" w:w="80"/>
+              <w:bottom w:type="dxa" w:w="40"/>
+              <w:right w:type="dxa" w:w="80"/>
+            </w:tcMar>
+          </w:tcPr>
+          <w:p>
+            <w:pPr>
+              <w:jc w:val="right"/>
+            </w:pPr>
+            <w:r>
+              <w:rPr>
+                <w:b w:val="false"/>
+                <w:bCs w:val="false"/>
+                <w:sz w:val="17"/>
+                <w:szCs w:val="17"/>
+              </w:rPr>
+              <w:t xml:space="preserve">+38%</w:t>
+            </w:r>
+          </w:p>
+        </w:tc>
+        <w:tc>
+          <w:tcPr>
+            <w:tcW w:type="dxa" w:w="800"/>
             <w:tcBorders>
               <w:top w:val="single" w:color="BFBFBF" w:sz="4"/>
               <w:left w:val="single" w:color="BFBFBF" w:sz="4"/>
@@ -6417,7 +6731,7 @@
         </w:tc>
         <w:tc>
           <w:tcPr>
-            <w:tcW w:type="dxa" w:w="800"/>
+            <w:tcW w:type="dxa" w:w="650"/>
             <w:tcBorders>
               <w:top w:val="single" w:color="BFBFBF" w:sz="4"/>
               <w:left w:val="single" w:color="BFBFBF" w:sz="4"/>
@@ -6448,32 +6762,32 @@
         </w:tc>
         <w:tc>
           <w:tcPr>
-            <w:tcW w:type="dxa" w:w="1776"/>
-            <w:tcBorders>
-              <w:top w:val="single" w:color="BFBFBF" w:sz="4"/>
-              <w:left w:val="single" w:color="BFBFBF" w:sz="4"/>
-              <w:bottom w:val="single" w:color="BFBFBF" w:sz="4"/>
-              <w:right w:val="single" w:color="BFBFBF" w:sz="4"/>
-            </w:tcBorders>
-            <w:tcMar>
-              <w:top w:type="dxa" w:w="40"/>
-              <w:left w:type="dxa" w:w="80"/>
-              <w:bottom w:type="dxa" w:w="40"/>
-              <w:right w:type="dxa" w:w="80"/>
-            </w:tcMar>
-          </w:tcPr>
-          <w:p>
-            <w:pPr>
-              <w:jc w:val="right"/>
-            </w:pPr>
-            <w:r>
-              <w:rPr>
-                <w:b w:val="false"/>
-                <w:bCs w:val="false"/>
-                <w:sz w:val="17"/>
-                <w:szCs w:val="17"/>
-              </w:rPr>
-              <w:t xml:space="preserve">281.6 / 203.0</w:t>
+            <w:tcW w:type="dxa" w:w="1526"/>
+            <w:tcBorders>
+              <w:top w:val="single" w:color="BFBFBF" w:sz="4"/>
+              <w:left w:val="single" w:color="BFBFBF" w:sz="4"/>
+              <w:bottom w:val="single" w:color="BFBFBF" w:sz="4"/>
+              <w:right w:val="single" w:color="BFBFBF" w:sz="4"/>
+            </w:tcBorders>
+            <w:tcMar>
+              <w:top w:type="dxa" w:w="40"/>
+              <w:left w:type="dxa" w:w="80"/>
+              <w:bottom w:type="dxa" w:w="40"/>
+              <w:right w:type="dxa" w:w="80"/>
+            </w:tcMar>
+          </w:tcPr>
+          <w:p>
+            <w:pPr>
+              <w:jc w:val="right"/>
+            </w:pPr>
+            <w:r>
+              <w:rPr>
+                <w:b w:val="false"/>
+                <w:bCs w:val="false"/>
+                <w:sz w:val="17"/>
+                <w:szCs w:val="17"/>
+              </w:rPr>
+              <w:t xml:space="preserve">281.2 / 203.0 (+39%)</w:t>
             </w:r>
           </w:p>
         </w:tc>
@@ -6481,7 +6795,7 @@
       <w:tr>
         <w:tc>
           <w:tcPr>
-            <w:tcW w:type="dxa" w:w="2500"/>
+            <w:tcW w:type="dxa" w:w="2050"/>
             <w:tcBorders>
               <w:top w:val="single" w:color="BFBFBF" w:sz="4"/>
               <w:left w:val="single" w:color="BFBFBF" w:sz="4"/>
@@ -6512,7 +6826,7 @@
         </w:tc>
         <w:tc>
           <w:tcPr>
-            <w:tcW w:type="dxa" w:w="950"/>
+            <w:tcW w:type="dxa" w:w="850"/>
             <w:tcBorders>
               <w:top w:val="single" w:color="BFBFBF" w:sz="4"/>
               <w:left w:val="single" w:color="BFBFBF" w:sz="4"/>
@@ -6543,69 +6857,100 @@
         </w:tc>
         <w:tc>
           <w:tcPr>
-            <w:tcW w:type="dxa" w:w="1000"/>
-            <w:tcBorders>
-              <w:top w:val="single" w:color="BFBFBF" w:sz="4"/>
-              <w:left w:val="single" w:color="BFBFBF" w:sz="4"/>
-              <w:bottom w:val="single" w:color="BFBFBF" w:sz="4"/>
-              <w:right w:val="single" w:color="BFBFBF" w:sz="4"/>
-            </w:tcBorders>
-            <w:tcMar>
-              <w:top w:type="dxa" w:w="40"/>
-              <w:left w:type="dxa" w:w="80"/>
-              <w:bottom w:type="dxa" w:w="40"/>
-              <w:right w:type="dxa" w:w="80"/>
-            </w:tcMar>
-          </w:tcPr>
-          <w:p>
-            <w:pPr>
-              <w:jc w:val="right"/>
-            </w:pPr>
-            <w:r>
-              <w:rPr>
-                <w:b w:val="false"/>
-                <w:bCs w:val="false"/>
-                <w:sz w:val="17"/>
-                <w:szCs w:val="17"/>
-              </w:rPr>
-              <w:t xml:space="preserve">123.1</w:t>
-            </w:r>
-          </w:p>
-        </w:tc>
-        <w:tc>
-          <w:tcPr>
-            <w:tcW w:type="dxa" w:w="1050"/>
-            <w:tcBorders>
-              <w:top w:val="single" w:color="BFBFBF" w:sz="4"/>
-              <w:left w:val="single" w:color="BFBFBF" w:sz="4"/>
-              <w:bottom w:val="single" w:color="BFBFBF" w:sz="4"/>
-              <w:right w:val="single" w:color="BFBFBF" w:sz="4"/>
-            </w:tcBorders>
-            <w:tcMar>
-              <w:top w:type="dxa" w:w="40"/>
-              <w:left w:type="dxa" w:w="80"/>
-              <w:bottom w:type="dxa" w:w="40"/>
-              <w:right w:type="dxa" w:w="80"/>
-            </w:tcMar>
-          </w:tcPr>
-          <w:p>
-            <w:pPr>
-              <w:jc w:val="right"/>
-            </w:pPr>
-            <w:r>
-              <w:rPr>
-                <w:b w:val="false"/>
-                <w:bCs w:val="false"/>
-                <w:sz w:val="17"/>
-                <w:szCs w:val="17"/>
-              </w:rPr>
-              <w:t xml:space="preserve">128.5</w:t>
-            </w:r>
-          </w:p>
-        </w:tc>
-        <w:tc>
-          <w:tcPr>
-            <w:tcW w:type="dxa" w:w="950"/>
+            <w:tcW w:type="dxa" w:w="1150"/>
+            <w:tcBorders>
+              <w:top w:val="single" w:color="BFBFBF" w:sz="4"/>
+              <w:left w:val="single" w:color="BFBFBF" w:sz="4"/>
+              <w:bottom w:val="single" w:color="BFBFBF" w:sz="4"/>
+              <w:right w:val="single" w:color="BFBFBF" w:sz="4"/>
+            </w:tcBorders>
+            <w:tcMar>
+              <w:top w:type="dxa" w:w="40"/>
+              <w:left w:type="dxa" w:w="80"/>
+              <w:bottom w:type="dxa" w:w="40"/>
+              <w:right w:type="dxa" w:w="80"/>
+            </w:tcMar>
+          </w:tcPr>
+          <w:p>
+            <w:pPr>
+              <w:jc w:val="right"/>
+            </w:pPr>
+            <w:r>
+              <w:rPr>
+                <w:b w:val="false"/>
+                <w:bCs w:val="false"/>
+                <w:sz w:val="17"/>
+                <w:szCs w:val="17"/>
+              </w:rPr>
+              <w:t xml:space="preserve">+123.1 (+28%)</w:t>
+            </w:r>
+          </w:p>
+        </w:tc>
+        <w:tc>
+          <w:tcPr>
+            <w:tcW w:type="dxa" w:w="1150"/>
+            <w:tcBorders>
+              <w:top w:val="single" w:color="BFBFBF" w:sz="4"/>
+              <w:left w:val="single" w:color="BFBFBF" w:sz="4"/>
+              <w:bottom w:val="single" w:color="BFBFBF" w:sz="4"/>
+              <w:right w:val="single" w:color="BFBFBF" w:sz="4"/>
+            </w:tcBorders>
+            <w:tcMar>
+              <w:top w:type="dxa" w:w="40"/>
+              <w:left w:type="dxa" w:w="80"/>
+              <w:bottom w:type="dxa" w:w="40"/>
+              <w:right w:type="dxa" w:w="80"/>
+            </w:tcMar>
+          </w:tcPr>
+          <w:p>
+            <w:pPr>
+              <w:jc w:val="right"/>
+            </w:pPr>
+            <w:r>
+              <w:rPr>
+                <w:b w:val="false"/>
+                <w:bCs w:val="false"/>
+                <w:sz w:val="17"/>
+                <w:szCs w:val="17"/>
+              </w:rPr>
+              <w:t xml:space="preserve">128.5 (29%)</w:t>
+            </w:r>
+          </w:p>
+        </w:tc>
+        <w:tc>
+          <w:tcPr>
+            <w:tcW w:type="dxa" w:w="850"/>
+            <w:tcBorders>
+              <w:top w:val="single" w:color="BFBFBF" w:sz="4"/>
+              <w:left w:val="single" w:color="BFBFBF" w:sz="4"/>
+              <w:bottom w:val="single" w:color="BFBFBF" w:sz="4"/>
+              <w:right w:val="single" w:color="BFBFBF" w:sz="4"/>
+            </w:tcBorders>
+            <w:tcMar>
+              <w:top w:type="dxa" w:w="40"/>
+              <w:left w:type="dxa" w:w="80"/>
+              <w:bottom w:type="dxa" w:w="40"/>
+              <w:right w:type="dxa" w:w="80"/>
+            </w:tcMar>
+          </w:tcPr>
+          <w:p>
+            <w:pPr>
+              <w:jc w:val="right"/>
+            </w:pPr>
+            <w:r>
+              <w:rPr>
+                <w:b w:val="false"/>
+                <w:bCs w:val="false"/>
+                <w:sz w:val="17"/>
+                <w:szCs w:val="17"/>
+              </w:rPr>
+              <w:t xml:space="preserve">+29%</w:t>
+            </w:r>
+          </w:p>
+        </w:tc>
+        <w:tc>
+          <w:tcPr>
+            <w:tcW w:type="dxa" w:w="800"/>
             <w:tcBorders>
               <w:top w:val="single" w:color="BFBFBF" w:sz="4"/>
               <w:left w:val="single" w:color="BFBFBF" w:sz="4"/>
@@ -6636,7 +6981,7 @@
         </w:tc>
         <w:tc>
           <w:tcPr>
-            <w:tcW w:type="dxa" w:w="800"/>
+            <w:tcW w:type="dxa" w:w="650"/>
             <w:tcBorders>
               <w:top w:val="single" w:color="BFBFBF" w:sz="4"/>
               <w:left w:val="single" w:color="BFBFBF" w:sz="4"/>
@@ -6667,32 +7012,32 @@
         </w:tc>
         <w:tc>
           <w:tcPr>
-            <w:tcW w:type="dxa" w:w="1776"/>
-            <w:tcBorders>
-              <w:top w:val="single" w:color="BFBFBF" w:sz="4"/>
-              <w:left w:val="single" w:color="BFBFBF" w:sz="4"/>
-              <w:bottom w:val="single" w:color="BFBFBF" w:sz="4"/>
-              <w:right w:val="single" w:color="BFBFBF" w:sz="4"/>
-            </w:tcBorders>
-            <w:tcMar>
-              <w:top w:type="dxa" w:w="40"/>
-              <w:left w:type="dxa" w:w="80"/>
-              <w:bottom w:type="dxa" w:w="40"/>
-              <w:right w:type="dxa" w:w="80"/>
-            </w:tcMar>
-          </w:tcPr>
-          <w:p>
-            <w:pPr>
-              <w:jc w:val="right"/>
-            </w:pPr>
-            <w:r>
-              <w:rPr>
-                <w:b w:val="false"/>
-                <w:bCs w:val="false"/>
-                <w:sz w:val="17"/>
-                <w:szCs w:val="17"/>
-              </w:rPr>
-              <w:t xml:space="preserve">262.1 / 202.9</w:t>
+            <w:tcW w:type="dxa" w:w="1526"/>
+            <w:tcBorders>
+              <w:top w:val="single" w:color="BFBFBF" w:sz="4"/>
+              <w:left w:val="single" w:color="BFBFBF" w:sz="4"/>
+              <w:bottom w:val="single" w:color="BFBFBF" w:sz="4"/>
+              <w:right w:val="single" w:color="BFBFBF" w:sz="4"/>
+            </w:tcBorders>
+            <w:tcMar>
+              <w:top w:type="dxa" w:w="40"/>
+              <w:left w:type="dxa" w:w="80"/>
+              <w:bottom w:type="dxa" w:w="40"/>
+              <w:right w:type="dxa" w:w="80"/>
+            </w:tcMar>
+          </w:tcPr>
+          <w:p>
+            <w:pPr>
+              <w:jc w:val="right"/>
+            </w:pPr>
+            <w:r>
+              <w:rPr>
+                <w:b w:val="false"/>
+                <w:bCs w:val="false"/>
+                <w:sz w:val="17"/>
+                <w:szCs w:val="17"/>
+              </w:rPr>
+              <w:t xml:space="preserve">262.1 / 202.9 (+29%)</w:t>
             </w:r>
           </w:p>
         </w:tc>
@@ -6700,7 +7045,7 @@
       <w:tr>
         <w:tc>
           <w:tcPr>
-            <w:tcW w:type="dxa" w:w="2500"/>
+            <w:tcW w:type="dxa" w:w="2050"/>
             <w:tcBorders>
               <w:top w:val="single" w:color="BFBFBF" w:sz="4"/>
               <w:left w:val="single" w:color="BFBFBF" w:sz="4"/>
@@ -6731,7 +7076,7 @@
         </w:tc>
         <w:tc>
           <w:tcPr>
-            <w:tcW w:type="dxa" w:w="950"/>
+            <w:tcW w:type="dxa" w:w="850"/>
             <w:tcBorders>
               <w:top w:val="single" w:color="BFBFBF" w:sz="4"/>
               <w:left w:val="single" w:color="BFBFBF" w:sz="4"/>
@@ -6762,69 +7107,100 @@
         </w:tc>
         <w:tc>
           <w:tcPr>
-            <w:tcW w:type="dxa" w:w="1000"/>
-            <w:tcBorders>
-              <w:top w:val="single" w:color="BFBFBF" w:sz="4"/>
-              <w:left w:val="single" w:color="BFBFBF" w:sz="4"/>
-              <w:bottom w:val="single" w:color="BFBFBF" w:sz="4"/>
-              <w:right w:val="single" w:color="BFBFBF" w:sz="4"/>
-            </w:tcBorders>
-            <w:tcMar>
-              <w:top w:type="dxa" w:w="40"/>
-              <w:left w:type="dxa" w:w="80"/>
-              <w:bottom w:type="dxa" w:w="40"/>
-              <w:right w:type="dxa" w:w="80"/>
-            </w:tcMar>
-          </w:tcPr>
-          <w:p>
-            <w:pPr>
-              <w:jc w:val="right"/>
-            </w:pPr>
-            <w:r>
-              <w:rPr>
-                <w:b w:val="false"/>
-                <w:bCs w:val="false"/>
-                <w:sz w:val="17"/>
-                <w:szCs w:val="17"/>
-              </w:rPr>
-              <w:t xml:space="preserve">63.3</w:t>
-            </w:r>
-          </w:p>
-        </w:tc>
-        <w:tc>
-          <w:tcPr>
-            <w:tcW w:type="dxa" w:w="1050"/>
-            <w:tcBorders>
-              <w:top w:val="single" w:color="BFBFBF" w:sz="4"/>
-              <w:left w:val="single" w:color="BFBFBF" w:sz="4"/>
-              <w:bottom w:val="single" w:color="BFBFBF" w:sz="4"/>
-              <w:right w:val="single" w:color="BFBFBF" w:sz="4"/>
-            </w:tcBorders>
-            <w:tcMar>
-              <w:top w:type="dxa" w:w="40"/>
-              <w:left w:type="dxa" w:w="80"/>
-              <w:bottom w:type="dxa" w:w="40"/>
-              <w:right w:type="dxa" w:w="80"/>
-            </w:tcMar>
-          </w:tcPr>
-          <w:p>
-            <w:pPr>
-              <w:jc w:val="right"/>
-            </w:pPr>
-            <w:r>
-              <w:rPr>
-                <w:b w:val="false"/>
-                <w:bCs w:val="false"/>
-                <w:sz w:val="17"/>
-                <w:szCs w:val="17"/>
-              </w:rPr>
-              <w:t xml:space="preserve">86.4</w:t>
-            </w:r>
-          </w:p>
-        </w:tc>
-        <w:tc>
-          <w:tcPr>
-            <w:tcW w:type="dxa" w:w="950"/>
+            <w:tcW w:type="dxa" w:w="1150"/>
+            <w:tcBorders>
+              <w:top w:val="single" w:color="BFBFBF" w:sz="4"/>
+              <w:left w:val="single" w:color="BFBFBF" w:sz="4"/>
+              <w:bottom w:val="single" w:color="BFBFBF" w:sz="4"/>
+              <w:right w:val="single" w:color="BFBFBF" w:sz="4"/>
+            </w:tcBorders>
+            <w:tcMar>
+              <w:top w:type="dxa" w:w="40"/>
+              <w:left w:type="dxa" w:w="80"/>
+              <w:bottom w:type="dxa" w:w="40"/>
+              <w:right w:type="dxa" w:w="80"/>
+            </w:tcMar>
+          </w:tcPr>
+          <w:p>
+            <w:pPr>
+              <w:jc w:val="right"/>
+            </w:pPr>
+            <w:r>
+              <w:rPr>
+                <w:b w:val="false"/>
+                <w:bCs w:val="false"/>
+                <w:sz w:val="17"/>
+                <w:szCs w:val="17"/>
+              </w:rPr>
+              <w:t xml:space="preserve">+63.3 (+14%)</w:t>
+            </w:r>
+          </w:p>
+        </w:tc>
+        <w:tc>
+          <w:tcPr>
+            <w:tcW w:type="dxa" w:w="1150"/>
+            <w:tcBorders>
+              <w:top w:val="single" w:color="BFBFBF" w:sz="4"/>
+              <w:left w:val="single" w:color="BFBFBF" w:sz="4"/>
+              <w:bottom w:val="single" w:color="BFBFBF" w:sz="4"/>
+              <w:right w:val="single" w:color="BFBFBF" w:sz="4"/>
+            </w:tcBorders>
+            <w:tcMar>
+              <w:top w:type="dxa" w:w="40"/>
+              <w:left w:type="dxa" w:w="80"/>
+              <w:bottom w:type="dxa" w:w="40"/>
+              <w:right w:type="dxa" w:w="80"/>
+            </w:tcMar>
+          </w:tcPr>
+          <w:p>
+            <w:pPr>
+              <w:jc w:val="right"/>
+            </w:pPr>
+            <w:r>
+              <w:rPr>
+                <w:b w:val="false"/>
+                <w:bCs w:val="false"/>
+                <w:sz w:val="17"/>
+                <w:szCs w:val="17"/>
+              </w:rPr>
+              <w:t xml:space="preserve">86.4 (19%)</w:t>
+            </w:r>
+          </w:p>
+        </w:tc>
+        <w:tc>
+          <w:tcPr>
+            <w:tcW w:type="dxa" w:w="850"/>
+            <w:tcBorders>
+              <w:top w:val="single" w:color="BFBFBF" w:sz="4"/>
+              <w:left w:val="single" w:color="BFBFBF" w:sz="4"/>
+              <w:bottom w:val="single" w:color="BFBFBF" w:sz="4"/>
+              <w:right w:val="single" w:color="BFBFBF" w:sz="4"/>
+            </w:tcBorders>
+            <w:tcMar>
+              <w:top w:type="dxa" w:w="40"/>
+              <w:left w:type="dxa" w:w="80"/>
+              <w:bottom w:type="dxa" w:w="40"/>
+              <w:right w:type="dxa" w:w="80"/>
+            </w:tcMar>
+          </w:tcPr>
+          <w:p>
+            <w:pPr>
+              <w:jc w:val="right"/>
+            </w:pPr>
+            <w:r>
+              <w:rPr>
+                <w:b w:val="false"/>
+                <w:bCs w:val="false"/>
+                <w:sz w:val="17"/>
+                <w:szCs w:val="17"/>
+              </w:rPr>
+              <w:t xml:space="preserve">+15%</w:t>
+            </w:r>
+          </w:p>
+        </w:tc>
+        <w:tc>
+          <w:tcPr>
+            <w:tcW w:type="dxa" w:w="800"/>
             <w:tcBorders>
               <w:top w:val="single" w:color="BFBFBF" w:sz="4"/>
               <w:left w:val="single" w:color="BFBFBF" w:sz="4"/>
@@ -6855,7 +7231,7 @@
         </w:tc>
         <w:tc>
           <w:tcPr>
-            <w:tcW w:type="dxa" w:w="800"/>
+            <w:tcW w:type="dxa" w:w="650"/>
             <w:tcBorders>
               <w:top w:val="single" w:color="BFBFBF" w:sz="4"/>
               <w:left w:val="single" w:color="BFBFBF" w:sz="4"/>
@@ -6886,32 +7262,32 @@
         </w:tc>
         <w:tc>
           <w:tcPr>
-            <w:tcW w:type="dxa" w:w="1776"/>
-            <w:tcBorders>
-              <w:top w:val="single" w:color="BFBFBF" w:sz="4"/>
-              <w:left w:val="single" w:color="BFBFBF" w:sz="4"/>
-              <w:bottom w:val="single" w:color="BFBFBF" w:sz="4"/>
-              <w:right w:val="single" w:color="BFBFBF" w:sz="4"/>
-            </w:tcBorders>
-            <w:tcMar>
-              <w:top w:type="dxa" w:w="40"/>
-              <w:left w:type="dxa" w:w="80"/>
-              <w:bottom w:type="dxa" w:w="40"/>
-              <w:right w:type="dxa" w:w="80"/>
-            </w:tcMar>
-          </w:tcPr>
-          <w:p>
-            <w:pPr>
-              <w:jc w:val="right"/>
-            </w:pPr>
-            <w:r>
-              <w:rPr>
-                <w:b w:val="false"/>
-                <w:bCs w:val="false"/>
-                <w:sz w:val="17"/>
-                <w:szCs w:val="17"/>
-              </w:rPr>
-              <w:t xml:space="preserve">244.0 / 207.5</w:t>
+            <w:tcW w:type="dxa" w:w="1526"/>
+            <w:tcBorders>
+              <w:top w:val="single" w:color="BFBFBF" w:sz="4"/>
+              <w:left w:val="single" w:color="BFBFBF" w:sz="4"/>
+              <w:bottom w:val="single" w:color="BFBFBF" w:sz="4"/>
+              <w:right w:val="single" w:color="BFBFBF" w:sz="4"/>
+            </w:tcBorders>
+            <w:tcMar>
+              <w:top w:type="dxa" w:w="40"/>
+              <w:left w:type="dxa" w:w="80"/>
+              <w:bottom w:type="dxa" w:w="40"/>
+              <w:right w:type="dxa" w:w="80"/>
+            </w:tcMar>
+          </w:tcPr>
+          <w:p>
+            <w:pPr>
+              <w:jc w:val="right"/>
+            </w:pPr>
+            <w:r>
+              <w:rPr>
+                <w:b w:val="false"/>
+                <w:bCs w:val="false"/>
+                <w:sz w:val="17"/>
+                <w:szCs w:val="17"/>
+              </w:rPr>
+              <w:t xml:space="preserve">244.0 / 207.5 (+18%)</w:t>
             </w:r>
           </w:p>
         </w:tc>
@@ -6927,7 +7303,7 @@
           <w:sz w:val="16"/>
           <w:szCs w:val="16"/>
         </w:rPr>
-        <w:t xml:space="preserve">The OSM-only rows come from an earlier run of the same code without the completion step (identical inputs otherwise).</w:t>
+        <w:t xml:space="preserve">The OSM-only rows come from a second pass of the same code (version 2.0.1, option --no-weiss) on identical inputs.</w:t>
       </w:r>
     </w:p>
     <w:p>

</xml_diff>